<commit_message>
docs(adr-003): reconcile to v2.4; cross-ref PLC-011/App A.9 zone distribution at DR sizing
</commit_message>
<xml_diff>
--- a/docs/adr/acrme_adr_003_capacity_management_during_dr.docx
+++ b/docs/adr/acrme_adr_003_capacity_management_during_dr.docx
@@ -33,7 +33,7 @@
         <w:t xml:space="preserve"> </w:t>
       </w:r>
       <w:r>
-        <w:t xml:space="preserve">Principal Cloud Architect — Architecture Governance</w:t>
+        <w:t xml:space="preserve">Principal Cloud Architect - Architecture Governance</w:t>
       </w:r>
       <w:r>
         <w:br/>
@@ -49,7 +49,7 @@
         <w:t xml:space="preserve"> </w:t>
       </w:r>
       <w:r>
-        <w:t xml:space="preserve">1.2</w:t>
+        <w:t xml:space="preserve">2.4</w:t>
       </w:r>
       <w:r>
         <w:br/>
@@ -65,7 +65,7 @@
         <w:t xml:space="preserve"> </w:t>
       </w:r>
       <w:r>
-        <w:t xml:space="preserve">August 2026</w:t>
+        <w:t xml:space="preserve">7 September 2026</w:t>
       </w:r>
       <w:r>
         <w:br/>
@@ -81,7 +81,7 @@
         <w:t xml:space="preserve"> </w:t>
       </w:r>
       <w:r>
-        <w:t xml:space="preserve">Accepted</w:t>
+        <w:t xml:space="preserve">Accepted - supersedes ADR-003 v1.2 fixed-ratio DR model; reconciled to Baseline v2.4</w:t>
       </w:r>
       <w:r>
         <w:br/>
@@ -97,7 +97,7 @@
         <w:t xml:space="preserve"> </w:t>
       </w:r>
       <w:r>
-        <w:t xml:space="preserve">ACRME Architecture Decision Records — one of four standalone, self-contained records.</w:t>
+        <w:t xml:space="preserve">ACRME Architecture Decision Records - aligned to Capacity &amp; Quota Management Requirements Baseline v2.4.</w:t>
       </w:r>
     </w:p>
     <w:p>
@@ -115,7 +115,7 @@
         <w:t xml:space="preserve"> </w:t>
       </w:r>
       <w:r>
-        <w:t xml:space="preserve">An Architecture Decision Record captures a single significant architectural decision, the context that forced it, the options considered, the choice made, and its consequences. ADRs are immutable once accepted — a superseding decision is recorded as a new ADR rather than editing the original. This record is self-contained: it can be read without any companion document. Evidence tags:</w:t>
+        <w:t xml:space="preserve">An Architecture Decision Record captures a significant architectural decision, the context that forced it, the options considered, the choice made, and its consequences. This ADR updates disaster-recovery capacity management to the lean bootstrap and distributed DR model. Evidence tags:</w:t>
       </w:r>
       <w:r>
         <w:t xml:space="preserve"> </w:t>
@@ -163,10 +163,111 @@
         <w:t xml:space="preserve">[Assumed]</w:t>
       </w:r>
       <w:r>
-        <w:t xml:space="preserve"> </w:t>
-      </w:r>
-      <w:r>
-        <w:t xml:space="preserve">(see Appendix).</w:t>
+        <w:t xml:space="preserve">.</w:t>
+      </w:r>
+    </w:p>
+    <w:p>
+      <w:pPr>
+        <w:pStyle w:val="BlockText"/>
+      </w:pPr>
+      <w:r>
+        <w:rPr>
+          <w:bCs/>
+          <w:b/>
+        </w:rPr>
+        <w:t xml:space="preserve">v2.4 reconciliation note.</w:t>
+      </w:r>
+      <w:r>
+        <w:t xml:space="preserve"> </w:t>
+      </w:r>
+      <w:r>
+        <w:t xml:space="preserve">The DR capacity model (max-not-sum sizing,</w:t>
+      </w:r>
+      <w:r>
+        <w:t xml:space="preserve"> </w:t>
+      </w:r>
+      <w:r>
+        <w:rPr>
+          <w:rStyle w:val="VerbatimChar"/>
+        </w:rPr>
+        <w:t xml:space="preserve">SourceDestinationDRIndex</w:t>
+      </w:r>
+      <w:r>
+        <w:t xml:space="preserve">, standby activation waves, CVAL earmark / no-double-count) is</w:t>
+      </w:r>
+      <w:r>
+        <w:t xml:space="preserve"> </w:t>
+      </w:r>
+      <w:r>
+        <w:rPr>
+          <w:bCs/>
+          <w:b/>
+        </w:rPr>
+        <w:t xml:space="preserve">unchanged</w:t>
+      </w:r>
+      <w:r>
+        <w:t xml:space="preserve"> </w:t>
+      </w:r>
+      <w:r>
+        <w:t xml:space="preserve">by Baseline v2.4. v2.4 adds the</w:t>
+      </w:r>
+      <w:r>
+        <w:t xml:space="preserve"> </w:t>
+      </w:r>
+      <w:r>
+        <w:rPr>
+          <w:bCs/>
+          <w:b/>
+        </w:rPr>
+        <w:t xml:space="preserve">even per-zone distribution target and rebalancing action (PLC-011, Appendix A.9)</w:t>
+      </w:r>
+      <w:r>
+        <w:t xml:space="preserve"> </w:t>
+      </w:r>
+      <w:r>
+        <w:t xml:space="preserve">and the</w:t>
+      </w:r>
+      <w:r>
+        <w:t xml:space="preserve"> </w:t>
+      </w:r>
+      <w:r>
+        <w:rPr>
+          <w:bCs/>
+          <w:b/>
+        </w:rPr>
+        <w:t xml:space="preserve">regional + per-AZ CRG structure (CAP-023)</w:t>
+      </w:r>
+      <w:r>
+        <w:t xml:space="preserve">; because DR sizing here is computed</w:t>
+      </w:r>
+      <w:r>
+        <w:t xml:space="preserve"> </w:t>
+      </w:r>
+      <w:r>
+        <w:rPr>
+          <w:bCs/>
+          <w:b/>
+        </w:rPr>
+        <w:t xml:space="preserve">per zone</w:t>
+      </w:r>
+      <w:r>
+        <w:t xml:space="preserve">, this ADR now cross-references PLC-011/A.9 at the sizing formula so per-zone DR floors and per-AZ CRG sizing stay balanced (see</w:t>
+      </w:r>
+      <w:r>
+        <w:t xml:space="preserve"> </w:t>
+      </w:r>
+      <w:r>
+        <w:rPr>
+          <w:iCs/>
+          <w:i/>
+        </w:rPr>
+        <w:t xml:space="preserve">DR Sizing Formula</w:t>
+      </w:r>
+      <w:r>
+        <w:t xml:space="preserve"> </w:t>
+      </w:r>
+      <w:r>
+        <w:t xml:space="preserve">below).</w:t>
       </w:r>
     </w:p>
     <w:p>
@@ -176,13 +277,13 @@
         </w:pict>
       </w:r>
     </w:p>
-    <w:bookmarkStart w:id="37" w:name="Xb03910cb3c9a0c0ecb9b813c5fa342521392efc"/>
+    <w:bookmarkStart w:id="35" w:name="X8ed65ec4e74e59ccff599c4eccb97353d380054"/>
     <w:p>
       <w:pPr>
         <w:pStyle w:val="Heading1"/>
       </w:pPr>
       <w:r>
-        <w:t xml:space="preserve">ADR-003 — Capacity Management during Disaster Recovery (DR)</w:t>
+        <w:t xml:space="preserve">ADR-003 - Capacity Management during Disaster Recovery (DR)</w:t>
       </w:r>
     </w:p>
     <w:p>
@@ -216,7 +317,7 @@
         <w:t xml:space="preserve"> </w:t>
       </w:r>
       <w:r>
-        <w:t xml:space="preserve">August 2026</w:t>
+        <w:t xml:space="preserve">27 August 2026</w:t>
       </w:r>
       <w:r>
         <w:br/>
@@ -232,7 +333,7 @@
         <w:t xml:space="preserve"> </w:t>
       </w:r>
       <w:r>
-        <w:t xml:space="preserve">Principal Cloud Architect, DR Owner, Platform Engineering, Security</w:t>
+        <w:t xml:space="preserve">Principal Cloud Architect, DR Owner, Platform Engineering, Security, FinOps</w:t>
       </w:r>
       <w:r>
         <w:br/>
@@ -242,62 +343,55 @@
           <w:bCs/>
           <w:b/>
         </w:rPr>
-        <w:t xml:space="preserve">Related constraints:</w:t>
-      </w:r>
-      <w:r>
-        <w:t xml:space="preserve"> </w:t>
-      </w:r>
-      <w:r>
-        <w:t xml:space="preserve">HC-1, HC-4, HC-6 (hard constraints)</w:t>
-      </w:r>
-    </w:p>
-    <w:bookmarkStart w:id="20" w:name="context"/>
-    <w:p>
-      <w:pPr>
-        <w:pStyle w:val="Heading3"/>
-      </w:pPr>
-      <w:r>
-        <w:t xml:space="preserve">Context</w:t>
-      </w:r>
-    </w:p>
-    <w:p>
-      <w:pPr>
-        <w:pStyle w:val="FirstParagraph"/>
-      </w:pPr>
-      <w:r>
-        <w:t xml:space="preserve">When a primary region fails, customers must recover in their DR region within a committed RTO. Pre-positioning a full 1:1 DR reserve is prohibitively expensive, yet under-provisioning risks a failed failover. During a crisis, waiting on Azure quota-increase approvals (hours) is unacceptable. The engine must also strictly separate</w:t>
-      </w:r>
-      <w:r>
-        <w:t xml:space="preserve"> </w:t>
+        <w:t xml:space="preserve">Related requirements:</w:t>
+      </w:r>
+      <w:r>
+        <w:t xml:space="preserve"> </w:t>
+      </w:r>
+      <w:r>
+        <w:t xml:space="preserve">ENV-003..ENV-006, DR-001..DR-019, PLC-010, DAT-002, DAT-003, OBS-001..OBS-004, OPS-001</w:t>
+      </w:r>
+      <w:r>
+        <w:br/>
       </w:r>
       <w:r>
         <w:rPr>
           <w:bCs/>
           <w:b/>
         </w:rPr>
-        <w:t xml:space="preserve">routine growth</w:t>
-      </w:r>
-      <w:r>
-        <w:t xml:space="preserve"> </w:t>
-      </w:r>
-      <w:r>
-        <w:t xml:space="preserve">from</w:t>
-      </w:r>
-      <w:r>
-        <w:t xml:space="preserve"> </w:t>
-      </w:r>
-      <w:r>
-        <w:rPr>
-          <w:bCs/>
-          <w:b/>
-        </w:rPr>
-        <w:t xml:space="preserve">destructive crisis operations</w:t>
-      </w:r>
-      <w:r>
-        <w:t xml:space="preserve"> </w:t>
-      </w:r>
-      <w:r>
-        <w:t xml:space="preserve">so that reconciliation can never accidentally trigger VM disruption.</w:t>
+        <w:t xml:space="preserve">Related POCs/decisions:</w:t>
+      </w:r>
+      <w:r>
+        <w:t xml:space="preserve"> </w:t>
+      </w:r>
+      <w:r>
+        <w:t xml:space="preserve">POC-001, POC-006, POC-007, POC-011, DEC-001, DEC-002, DEP-001</w:t>
+      </w:r>
+    </w:p>
+    <w:bookmarkStart w:id="20" w:name="context"/>
+    <w:p>
+      <w:pPr>
+        <w:pStyle w:val="Heading2"/>
+      </w:pPr>
+      <w:r>
+        <w:t xml:space="preserve">Context</w:t>
+      </w:r>
+    </w:p>
+    <w:p>
+      <w:pPr>
+        <w:pStyle w:val="FirstParagraph"/>
+      </w:pPr>
+      <w:r>
+        <w:t xml:space="preserve">The v1 DR model assumed a fixed 30-40% reserve relative to production. Requirements v2.1 explicitly rejects that as the default because idle DR reservations at platform scale are too expensive and do not reflect the single-region-failure assumption.</w:t>
+      </w:r>
+      <w:r>
+        <w:t xml:space="preserve"> </w:t>
+      </w:r>
+      <w:r>
+        <w:rPr>
+          <w:rStyle w:val="VerbatimChar"/>
+        </w:rPr>
+        <w:t xml:space="preserve">[Decided]</w:t>
       </w:r>
     </w:p>
     <w:p>
@@ -305,76 +399,7 @@
         <w:pStyle w:val="BodyText"/>
       </w:pPr>
       <w:r>
-        <w:t xml:space="preserve">Two capabilities are needed:</w:t>
-      </w:r>
-      <w:r>
-        <w:t xml:space="preserve"> </w:t>
-      </w:r>
-      <w:r>
-        <w:t xml:space="preserve">- A way to reuse otherwise-idle NonProd capacity as DR overflow.</w:t>
-      </w:r>
-      <w:r>
-        <w:t xml:space="preserve"> </w:t>
-      </w:r>
-      <w:r>
-        <w:t xml:space="preserve">- A safe, tiered escalation model for expanding DR capacity during a declared event.</w:t>
-      </w:r>
-    </w:p>
-    <w:bookmarkEnd w:id="20"/>
-    <w:bookmarkStart w:id="30" w:name="decision"/>
-    <w:p>
-      <w:pPr>
-        <w:pStyle w:val="Heading3"/>
-      </w:pPr>
-      <w:r>
-        <w:t xml:space="preserve">Decision</w:t>
-      </w:r>
-    </w:p>
-    <w:p>
-      <w:pPr>
-        <w:pStyle w:val="FirstParagraph"/>
-      </w:pPr>
-      <w:r>
-        <w:t xml:space="preserve">Adopt</w:t>
-      </w:r>
-      <w:r>
-        <w:t xml:space="preserve"> </w:t>
-      </w:r>
-      <w:r>
-        <w:rPr>
-          <w:bCs/>
-          <w:b/>
-        </w:rPr>
-        <w:t xml:space="preserve">NonProd/DR co-location with a coverage floor</w:t>
-      </w:r>
-      <w:r>
-        <w:t xml:space="preserve">, a</w:t>
-      </w:r>
-      <w:r>
-        <w:t xml:space="preserve"> </w:t>
-      </w:r>
-      <w:r>
-        <w:rPr>
-          <w:bCs/>
-          <w:b/>
-        </w:rPr>
-        <w:t xml:space="preserve">formal two-mode engine state</w:t>
-      </w:r>
-      <w:r>
-        <w:t xml:space="preserve">, and a</w:t>
-      </w:r>
-      <w:r>
-        <w:t xml:space="preserve"> </w:t>
-      </w:r>
-      <w:r>
-        <w:rPr>
-          <w:bCs/>
-          <w:b/>
-        </w:rPr>
-        <w:t xml:space="preserve">three-tier emergency transfer model</w:t>
-      </w:r>
-      <w:r>
-        <w:t xml:space="preserve">:</w:t>
+        <w:t xml:space="preserve">ACRME now needs a DR model that:</w:t>
       </w:r>
     </w:p>
     <w:p>
@@ -383,112 +408,10 @@
           <w:ilvl w:val="0"/>
           <w:numId w:val="1001"/>
         </w:numPr>
-      </w:pPr>
-      <w:r>
-        <w:rPr>
-          <w:bCs/>
-          <w:b/>
-        </w:rPr>
-        <w:t xml:space="preserve">NonProd and DR may share a region (HC-1 constraint removed).</w:t>
-      </w:r>
-      <w:r>
-        <w:t xml:space="preserve"> </w:t>
-      </w:r>
-      <w:r>
-        <w:t xml:space="preserve">This lets the NonProd CRG’s</w:t>
-      </w:r>
-      <w:r>
-        <w:t xml:space="preserve"> </w:t>
-      </w:r>
-      <w:r>
-        <w:rPr>
-          <w:rStyle w:val="VerbatimChar"/>
-        </w:rPr>
-        <w:t xml:space="preserve">effective_free</w:t>
-      </w:r>
-      <w:r>
-        <w:t xml:space="preserve"> </w:t>
-      </w:r>
-      <w:r>
-        <w:t xml:space="preserve">(after</w:t>
-      </w:r>
-      <w:r>
-        <w:t xml:space="preserve"> </w:t>
-      </w:r>
-      <w:r>
-        <w:rPr>
-          <w:rStyle w:val="VerbatimChar"/>
-        </w:rPr>
-        <w:t xml:space="preserve">dr_overflow_reserve</w:t>
-      </w:r>
-      <w:r>
-        <w:t xml:space="preserve">) count as DR overflow headroom.</w:t>
-      </w:r>
-      <w:r>
-        <w:t xml:space="preserve"> </w:t>
-      </w:r>
-      <w:r>
-        <w:rPr>
-          <w:rStyle w:val="VerbatimChar"/>
-        </w:rPr>
-        <w:t xml:space="preserve">[Decided]</w:t>
-      </w:r>
-    </w:p>
-    <w:p>
-      <w:pPr>
-        <w:numPr>
-          <w:ilvl w:val="1"/>
-          <w:numId w:val="1002"/>
-        </w:numPr>
-      </w:pPr>
-      <w:r>
-        <w:rPr>
-          <w:bCs/>
-          <w:b/>
-        </w:rPr>
-        <w:t xml:space="preserve">HC-6 DR_COVERAGE_FLOOR</w:t>
-      </w:r>
-      <w:r>
-        <w:t xml:space="preserve"> </w:t>
-      </w:r>
-      <w:r>
-        <w:t xml:space="preserve">guarantees the combined pool can absorb demand before DR placement is accepted:</w:t>
-      </w:r>
-    </w:p>
-    <w:p>
-      <w:pPr>
-        <w:numPr>
-          <w:ilvl w:val="1"/>
-          <w:numId w:val="1000"/>
-        </w:numPr>
-        <w:pStyle w:val="SourceCode"/>
-      </w:pPr>
-      <w:r>
-        <w:rPr>
-          <w:rStyle w:val="VerbatimChar"/>
-        </w:rPr>
-        <w:t xml:space="preserve">dr_crg_free_slots(R) + nonprod_crg_effective_free(R) ≥ prod_vm_count × dr_ratio_max</w:t>
-      </w:r>
-    </w:p>
-    <w:p>
-      <w:pPr>
-        <w:numPr>
-          <w:ilvl w:val="1"/>
-          <w:numId w:val="1002"/>
-        </w:numPr>
-      </w:pPr>
-      <w:r>
-        <w:rPr>
-          <w:bCs/>
-          <w:b/>
-        </w:rPr>
-        <w:t xml:space="preserve">HC-4 DR_SEPARATION_CLASS</w:t>
-      </w:r>
-      <w:r>
-        <w:t xml:space="preserve"> </w:t>
-      </w:r>
-      <w:r>
-        <w:t xml:space="preserve">still guarantees Prod and DR sit in non-correlated failure domains (HIGH separation for non-paired regions).</w:t>
+        <w:pStyle w:val="Compact"/>
+      </w:pPr>
+      <w:r>
+        <w:t xml:space="preserve">starts with configurable bootstrap capacity, not a percentage clone of production;</w:t>
       </w:r>
     </w:p>
     <w:p>
@@ -497,158 +420,10 @@
           <w:ilvl w:val="0"/>
           <w:numId w:val="1001"/>
         </w:numPr>
-      </w:pPr>
-      <w:r>
-        <w:rPr>
-          <w:bCs/>
-          <w:b/>
-        </w:rPr>
-        <w:t xml:space="preserve">Two separate operating systems gated by</w:t>
-      </w:r>
-      <w:r>
-        <w:rPr>
-          <w:bCs/>
-          <w:b/>
-        </w:rPr>
-        <w:t xml:space="preserve"> </w:t>
-      </w:r>
-      <w:r>
-        <w:rPr>
-          <w:rStyle w:val="VerbatimChar"/>
-          <w:bCs/>
-          <w:b/>
-        </w:rPr>
-        <w:t xml:space="preserve">engine_mode</w:t>
-      </w:r>
-      <w:r>
-        <w:rPr>
-          <w:bCs/>
-          <w:b/>
-        </w:rPr>
-        <w:t xml:space="preserve">:</w:t>
-      </w:r>
-      <w:r>
-        <w:t xml:space="preserve"> </w:t>
-      </w:r>
-      <w:r>
-        <w:rPr>
-          <w:rStyle w:val="VerbatimChar"/>
-        </w:rPr>
-        <w:t xml:space="preserve">[Decided]</w:t>
-      </w:r>
-    </w:p>
-    <w:p>
-      <w:pPr>
-        <w:numPr>
-          <w:ilvl w:val="1"/>
-          <w:numId w:val="1003"/>
-        </w:numPr>
         <w:pStyle w:val="Compact"/>
       </w:pPr>
       <w:r>
-        <w:rPr>
-          <w:rStyle w:val="VerbatimChar"/>
-          <w:bCs/>
-          <w:b/>
-        </w:rPr>
-        <w:t xml:space="preserve">STEADY_STATE</w:t>
-      </w:r>
-      <w:r>
-        <w:t xml:space="preserve"> </w:t>
-      </w:r>
-      <w:r>
-        <w:t xml:space="preserve">— organic growth via the reconciliation loop and</w:t>
-      </w:r>
-      <w:r>
-        <w:t xml:space="preserve"> </w:t>
-      </w:r>
-      <w:r>
-        <w:rPr>
-          <w:rStyle w:val="VerbatimChar"/>
-        </w:rPr>
-        <w:t xml:space="preserve">CapacityIncreaseRequest</w:t>
-      </w:r>
-      <w:r>
-        <w:t xml:space="preserve"> </w:t>
-      </w:r>
-      <w:r>
-        <w:t xml:space="preserve">(see ADR-004). Emergency Transfer is</w:t>
-      </w:r>
-      <w:r>
-        <w:t xml:space="preserve"> </w:t>
-      </w:r>
-      <w:r>
-        <w:rPr>
-          <w:bCs/>
-          <w:b/>
-        </w:rPr>
-        <w:t xml:space="preserve">rejected</w:t>
-      </w:r>
-      <w:r>
-        <w:t xml:space="preserve"> </w:t>
-      </w:r>
-      <w:r>
-        <w:t xml:space="preserve">in this mode.</w:t>
-      </w:r>
-    </w:p>
-    <w:p>
-      <w:pPr>
-        <w:numPr>
-          <w:ilvl w:val="1"/>
-          <w:numId w:val="1003"/>
-        </w:numPr>
-        <w:pStyle w:val="Compact"/>
-      </w:pPr>
-      <w:r>
-        <w:rPr>
-          <w:rStyle w:val="VerbatimChar"/>
-          <w:bCs/>
-          <w:b/>
-        </w:rPr>
-        <w:t xml:space="preserve">DR_EVENT_ACTIVE</w:t>
-      </w:r>
-      <w:r>
-        <w:t xml:space="preserve"> </w:t>
-      </w:r>
-      <w:r>
-        <w:t xml:space="preserve">— crisis operations only. The auto-increase trigger is</w:t>
-      </w:r>
-      <w:r>
-        <w:t xml:space="preserve"> </w:t>
-      </w:r>
-      <w:r>
-        <w:rPr>
-          <w:bCs/>
-          <w:b/>
-        </w:rPr>
-        <w:t xml:space="preserve">suppressed</w:t>
-      </w:r>
-      <w:r>
-        <w:t xml:space="preserve"> </w:t>
-      </w:r>
-      <w:r>
-        <w:t xml:space="preserve">in this mode. Mode transitions are operator-gated with dual approval (state machine</w:t>
-      </w:r>
-      <w:r>
-        <w:t xml:space="preserve"> </w:t>
-      </w:r>
-      <w:r>
-        <w:rPr>
-          <w:rStyle w:val="VerbatimChar"/>
-        </w:rPr>
-        <w:t xml:space="preserve">EngineModeState</w:t>
-      </w:r>
-      <w:r>
-        <w:t xml:space="preserve">), never automatic.</w:t>
-      </w:r>
-      <w:r>
-        <w:t xml:space="preserve"> </w:t>
-      </w:r>
-      <w:r>
-        <w:rPr>
-          <w:rStyle w:val="VerbatimChar"/>
-        </w:rPr>
-        <w:t xml:space="preserve">[Decided]</w:t>
+        <w:t xml:space="preserve">reconciles reserved capacity dynamically against allocated demand and policy buffers;</w:t>
       </w:r>
     </w:p>
     <w:p>
@@ -657,135 +432,10 @@
           <w:ilvl w:val="0"/>
           <w:numId w:val="1001"/>
         </w:numPr>
-      </w:pPr>
-      <w:r>
-        <w:rPr>
-          <w:bCs/>
-          <w:b/>
-        </w:rPr>
-        <w:t xml:space="preserve">Three-tier Emergency Capacity Transfer escalation:</w:t>
-      </w:r>
-      <w:r>
-        <w:t xml:space="preserve"> </w:t>
-      </w:r>
-      <w:r>
-        <w:rPr>
-          <w:rStyle w:val="VerbatimChar"/>
-        </w:rPr>
-        <w:t xml:space="preserve">[Decided]</w:t>
-      </w:r>
-    </w:p>
-    <w:p>
-      <w:pPr>
-        <w:numPr>
-          <w:ilvl w:val="1"/>
-          <w:numId w:val="1004"/>
-        </w:numPr>
         <w:pStyle w:val="Compact"/>
       </w:pPr>
       <w:r>
-        <w:rPr>
-          <w:bCs/>
-          <w:b/>
-        </w:rPr>
-        <w:t xml:space="preserve">Tier 1 — DirectExpansion (automated):</w:t>
-      </w:r>
-      <w:r>
-        <w:t xml:space="preserve"> </w:t>
-      </w:r>
-      <w:r>
-        <w:t xml:space="preserve">expand DR CR quantity using free headroom in the DR group. No approval beyond DR-event declaration.</w:t>
-      </w:r>
-    </w:p>
-    <w:p>
-      <w:pPr>
-        <w:numPr>
-          <w:ilvl w:val="1"/>
-          <w:numId w:val="1004"/>
-        </w:numPr>
-        <w:pStyle w:val="Compact"/>
-      </w:pPr>
-      <w:r>
-        <w:rPr>
-          <w:bCs/>
-          <w:b/>
-        </w:rPr>
-        <w:t xml:space="preserve">Tier 2 — QuotaNeutralTransfer (policy-gated):</w:t>
-      </w:r>
-      <w:r>
-        <w:t xml:space="preserve"> </w:t>
-      </w:r>
-      <w:r>
-        <w:t xml:space="preserve">reduce a NonProd CR (releasing quota to the shared NonProd+DR group pool) and expand the DR CR from that same pool. Net group headroom change ≈ 0 —</w:t>
-      </w:r>
-      <w:r>
-        <w:t xml:space="preserve"> </w:t>
-      </w:r>
-      <w:r>
-        <w:rPr>
-          <w:bCs/>
-          <w:b/>
-        </w:rPr>
-        <w:t xml:space="preserve">quota-neutral, no VM execution-state change</w:t>
-      </w:r>
-      <w:r>
-        <w:t xml:space="preserve"> </w:t>
-      </w:r>
-      <w:r>
-        <w:t xml:space="preserve">(only NonProd SLA is removed). This is possible</w:t>
-      </w:r>
-      <w:r>
-        <w:t xml:space="preserve"> </w:t>
-      </w:r>
-      <w:r>
-        <w:rPr>
-          <w:iCs/>
-          <w:i/>
-        </w:rPr>
-        <w:t xml:space="preserve">only</w:t>
-      </w:r>
-      <w:r>
-        <w:t xml:space="preserve"> </w:t>
-      </w:r>
-      <w:r>
-        <w:t xml:space="preserve">because of the two-group model (see ADR-002).</w:t>
-      </w:r>
-    </w:p>
-    <w:p>
-      <w:pPr>
-        <w:numPr>
-          <w:ilvl w:val="1"/>
-          <w:numId w:val="1004"/>
-        </w:numPr>
-        <w:pStyle w:val="Compact"/>
-      </w:pPr>
-      <w:r>
-        <w:rPr>
-          <w:bCs/>
-          <w:b/>
-        </w:rPr>
-        <w:t xml:space="preserve">Tier 3 — DestructiveTransfer (dual approval + elevated RBAC):</w:t>
-      </w:r>
-      <w:r>
-        <w:t xml:space="preserve"> </w:t>
-      </w:r>
-      <w:r>
-        <w:t xml:space="preserve">the only tier that modifies VM-to-CRG associations. The operator supplies an explicit</w:t>
-      </w:r>
-      <w:r>
-        <w:t xml:space="preserve"> </w:t>
-      </w:r>
-      <w:r>
-        <w:rPr>
-          <w:rStyle w:val="VerbatimChar"/>
-        </w:rPr>
-        <w:t xml:space="preserve">vm_disassociation_list</w:t>
-      </w:r>
-      <w:r>
-        <w:t xml:space="preserve"> </w:t>
-      </w:r>
-      <w:r>
-        <w:t xml:space="preserve">(no automated VM selection in Phase 1); executed via 6-step Path B with Path A fallback per VM. VMSS entries are rejected in Phase 1.</w:t>
+        <w:t xml:space="preserve">uses CVAL/NonProd as a potential DR capacity source only under authorised runbooks;</w:t>
       </w:r>
     </w:p>
     <w:p>
@@ -794,46 +444,10 @@
           <w:ilvl w:val="0"/>
           <w:numId w:val="1001"/>
         </w:numPr>
-      </w:pPr>
-      <w:r>
-        <w:rPr>
-          <w:bCs/>
-          <w:b/>
-        </w:rPr>
-        <w:t xml:space="preserve">Quota-neutral math (Tier 2):</w:t>
-      </w:r>
-    </w:p>
-    <w:p>
-      <w:pPr>
-        <w:numPr>
-          <w:ilvl w:val="0"/>
-          <w:numId w:val="1000"/>
-        </w:numPr>
-        <w:pStyle w:val="SourceCode"/>
-      </w:pPr>
-      <w:r>
-        <w:rPr>
-          <w:rStyle w:val="VerbatimChar"/>
-        </w:rPr>
-        <w:t xml:space="preserve">NonProd CR reduction  → releases quota to shared NonProd+DR GROUP pool</w:t>
-      </w:r>
-      <w:r>
-        <w:br/>
-      </w:r>
-      <w:r>
-        <w:rPr>
-          <w:rStyle w:val="VerbatimChar"/>
-        </w:rPr>
-        <w:t xml:space="preserve">DR CR expansion       → consumes from the SAME pool</w:t>
-      </w:r>
-      <w:r>
-        <w:br/>
-      </w:r>
-      <w:r>
-        <w:rPr>
-          <w:rStyle w:val="VerbatimChar"/>
-        </w:rPr>
-        <w:t xml:space="preserve">⇒ net group headroom change ≈ 0  (ARM operations only; no Azure quota approval)</w:t>
+        <w:pStyle w:val="Compact"/>
+      </w:pPr>
+      <w:r>
+        <w:t xml:space="preserve">supports reciprocal multi-source DR hosting, where any region may simultaneously host Prod, CVAL, and DR standby for different customers;</w:t>
       </w:r>
     </w:p>
     <w:p>
@@ -842,82 +456,10 @@
           <w:ilvl w:val="0"/>
           <w:numId w:val="1001"/>
         </w:numPr>
-      </w:pPr>
-      <w:r>
-        <w:rPr>
-          <w:bCs/>
-          <w:b/>
-        </w:rPr>
-        <w:t xml:space="preserve">DR reserve sizing</w:t>
-      </w:r>
-      <w:r>
-        <w:t xml:space="preserve"> </w:t>
-      </w:r>
-      <w:r>
-        <w:t xml:space="preserve">is</w:t>
-      </w:r>
-      <w:r>
-        <w:t xml:space="preserve"> </w:t>
-      </w:r>
-      <w:r>
-        <w:rPr>
-          <w:rStyle w:val="VerbatimChar"/>
-        </w:rPr>
-        <w:t xml:space="preserve">30–40%</w:t>
-      </w:r>
-      <w:r>
-        <w:t xml:space="preserve"> </w:t>
-      </w:r>
-      <w:r>
-        <w:t xml:space="preserve">of Prod (</w:t>
-      </w:r>
-      <w:r>
-        <w:rPr>
-          <w:rStyle w:val="VerbatimChar"/>
-        </w:rPr>
-        <w:t xml:space="preserve">dr_ratio_min=0.30</w:t>
-      </w:r>
-      <w:r>
-        <w:t xml:space="preserve">,</w:t>
-      </w:r>
-      <w:r>
-        <w:t xml:space="preserve"> </w:t>
-      </w:r>
-      <w:r>
-        <w:rPr>
-          <w:rStyle w:val="VerbatimChar"/>
-        </w:rPr>
-        <w:t xml:space="preserve">dr_ratio_max=0.40</w:t>
-      </w:r>
-      <w:r>
-        <w:t xml:space="preserve">,</w:t>
-      </w:r>
-      <w:r>
-        <w:t xml:space="preserve"> </w:t>
-      </w:r>
-      <w:r>
-        <w:rPr>
-          <w:rStyle w:val="VerbatimChar"/>
-        </w:rPr>
-        <w:t xml:space="preserve">dr_ratio_target=0.35</w:t>
-      </w:r>
-      <w:r>
-        <w:t xml:space="preserve">); the protected floor uses</w:t>
-      </w:r>
-      <w:r>
-        <w:t xml:space="preserve"> </w:t>
-      </w:r>
-      <w:r>
-        <w:rPr>
-          <w:rStyle w:val="VerbatimChar"/>
-        </w:rPr>
-        <w:t xml:space="preserve">dr_ratio_max</w:t>
-      </w:r>
-      <w:r>
-        <w:t xml:space="preserve"> </w:t>
-      </w:r>
-      <w:r>
-        <w:t xml:space="preserve">(see ADR-002).</w:t>
+        <w:pStyle w:val="Compact"/>
+      </w:pPr>
+      <w:r>
+        <w:t xml:space="preserve">sizes each DR destination using max-over-non-concurrent-source demand;</w:t>
       </w:r>
     </w:p>
     <w:p>
@@ -926,151 +468,1376 @@
           <w:ilvl w:val="0"/>
           <w:numId w:val="1001"/>
         </w:numPr>
-      </w:pPr>
+        <w:pStyle w:val="Compact"/>
+      </w:pPr>
+      <w:r>
+        <w:t xml:space="preserve">activates the correct standby set by source-region failure; and</w:t>
+      </w:r>
+    </w:p>
+    <w:p>
+      <w:pPr>
+        <w:numPr>
+          <w:ilvl w:val="0"/>
+          <w:numId w:val="1001"/>
+        </w:numPr>
+        <w:pStyle w:val="Compact"/>
+      </w:pPr>
+      <w:r>
+        <w:t xml:space="preserve">preserves auditability and failback reversibility.</w:t>
+      </w:r>
+      <w:r>
+        <w:t xml:space="preserve"> </w:t>
+      </w:r>
+      <w:r>
+        <w:rPr>
+          <w:rStyle w:val="VerbatimChar"/>
+        </w:rPr>
+        <w:t xml:space="preserve">[Derived]</w:t>
+      </w:r>
+    </w:p>
+    <w:bookmarkEnd w:id="20"/>
+    <w:bookmarkStart w:id="21" w:name="decision"/>
+    <w:p>
+      <w:pPr>
+        <w:pStyle w:val="Heading2"/>
+      </w:pPr>
+      <w:r>
+        <w:t xml:space="preserve">Decision</w:t>
+      </w:r>
+    </w:p>
+    <w:p>
+      <w:pPr>
+        <w:pStyle w:val="FirstParagraph"/>
+      </w:pPr>
+      <w:r>
+        <w:t xml:space="preserve">Adopt a</w:t>
+      </w:r>
+      <w:r>
+        <w:t xml:space="preserve"> </w:t>
+      </w:r>
       <w:r>
         <w:rPr>
           <w:bCs/>
           <w:b/>
         </w:rPr>
-        <w:t xml:space="preserve">Phase-1 safety posture:</w:t>
-      </w:r>
-      <w:r>
-        <w:t xml:space="preserve"> </w:t>
-      </w:r>
-      <w:r>
-        <w:t xml:space="preserve">Tier 2 is approval-gated;</w:t>
-      </w:r>
-      <w:r>
-        <w:t xml:space="preserve"> </w:t>
-      </w:r>
+        <w:t xml:space="preserve">lean bootstrap plus distributed DR capacity architecture</w:t>
+      </w:r>
+      <w:r>
+        <w:t xml:space="preserve">:</w:t>
+      </w:r>
+    </w:p>
+    <w:p>
+      <w:pPr>
+        <w:numPr>
+          <w:ilvl w:val="0"/>
+          <w:numId w:val="1002"/>
+        </w:numPr>
+      </w:pPr>
       <w:r>
         <w:rPr>
           <w:bCs/>
           <w:b/>
         </w:rPr>
-        <w:t xml:space="preserve">Tier 3 is blocked</w:t>
-      </w:r>
-      <w:r>
-        <w:t xml:space="preserve"> </w:t>
-      </w:r>
-      <w:r>
-        <w:t xml:space="preserve">pending the consumer-credential model and the engine-mode state machine. No invented SLA — propagation/approval times are measured and reported as unknown until observed.</w:t>
-      </w:r>
-    </w:p>
-    <w:p>
-      <w:pPr>
-        <w:pStyle w:val="CaptionedFigure"/>
-      </w:pPr>
-      <w:r>
-        <w:drawing>
-          <wp:inline>
-            <wp:extent cx="5334000" cy="17597437"/>
-            <wp:effectExtent b="0" l="0" r="0" t="0"/>
-            <wp:docPr descr="Figure 1. Three-tier Emergency Capacity Transfer escalation — Tier 1 automated, Tier 2 quota-neutral, Tier 3 destructive (blocked in Phase 1)." title="" id="22" name="Picture"/>
-            <a:graphic>
-              <a:graphicData uri="http://schemas.openxmlformats.org/drawingml/2006/picture">
-                <pic:pic>
-                  <pic:nvPicPr>
-                    <pic:cNvPr descr="diagrams/adr003_transfer_tiers.png" id="23" name="Picture"/>
-                    <pic:cNvPicPr>
-                      <a:picLocks noChangeArrowheads="1" noChangeAspect="1"/>
-                    </pic:cNvPicPr>
-                  </pic:nvPicPr>
-                  <pic:blipFill>
-                    <a:blip r:embed="rId21"/>
-                    <a:stretch>
-                      <a:fillRect/>
-                    </a:stretch>
-                  </pic:blipFill>
-                  <pic:spPr bwMode="auto">
-                    <a:xfrm>
-                      <a:off x="0" y="0"/>
-                      <a:ext cx="5334000" cy="17597437"/>
-                    </a:xfrm>
-                    <a:prstGeom prst="rect">
-                      <a:avLst/>
-                    </a:prstGeom>
-                    <a:noFill/>
-                    <a:ln w="9525">
-                      <a:noFill/>
-                      <a:headEnd/>
-                      <a:tailEnd/>
-                    </a:ln>
-                  </pic:spPr>
-                </pic:pic>
-              </a:graphicData>
-            </a:graphic>
-          </wp:inline>
-        </w:drawing>
-      </w:r>
-    </w:p>
-    <w:p>
-      <w:pPr>
-        <w:pStyle w:val="ImageCaption"/>
+        <w:t xml:space="preserve">DR starts lean.</w:t>
+      </w:r>
+      <w:r>
+        <w:t xml:space="preserve"> </w:t>
+      </w:r>
+      <w:r>
+        <w:t xml:space="preserve">DR holds a configurable bootstrap target by workload, product, region, zone, SKU/family, and subscription model. It must not default to a fixed 30-40% copy of production. Zero bootstrap is allowed only through explicit approved policy.</w:t>
+      </w:r>
+      <w:r>
+        <w:t xml:space="preserve"> </w:t>
+      </w:r>
+      <w:r>
+        <w:rPr>
+          <w:rStyle w:val="VerbatimChar"/>
+        </w:rPr>
+        <w:t xml:space="preserve">[Decided]</w:t>
+      </w:r>
+    </w:p>
+    <w:p>
+      <w:pPr>
+        <w:numPr>
+          <w:ilvl w:val="0"/>
+          <w:numId w:val="1002"/>
+        </w:numPr>
       </w:pPr>
       <w:r>
         <w:rPr>
           <w:bCs/>
           <w:b/>
         </w:rPr>
-        <w:t xml:space="preserve">Figure 1.</w:t>
-      </w:r>
-      <w:r>
-        <w:t xml:space="preserve"> </w:t>
-      </w:r>
-      <w:r>
-        <w:t xml:space="preserve">Three-tier Emergency Capacity Transfer escalation — Tier 1 automated, Tier 2 quota-neutral, Tier 3 destructive (blocked in Phase 1).</w:t>
-      </w:r>
-    </w:p>
-    <w:bookmarkStart w:id="27" w:name="full-engine-state-machine-normative"/>
-    <w:p>
-      <w:pPr>
-        <w:pStyle w:val="Heading4"/>
-      </w:pPr>
-      <w:r>
-        <w:t xml:space="preserve">Full Engine State Machine (normative)</w:t>
-      </w:r>
-    </w:p>
-    <w:p>
-      <w:pPr>
-        <w:pStyle w:val="FirstParagraph"/>
-      </w:pPr>
-      <w:r>
-        <w:rPr>
-          <w:rStyle w:val="VerbatimChar"/>
-        </w:rPr>
-        <w:t xml:space="preserve">engine_mode</w:t>
-      </w:r>
-      <w:r>
-        <w:t xml:space="preserve"> </w:t>
-      </w:r>
-      <w:r>
-        <w:t xml:space="preserve">is not a two-value flag but a</w:t>
-      </w:r>
-      <w:r>
-        <w:t xml:space="preserve"> </w:t>
-      </w:r>
+        <w:t xml:space="preserve">Destination sizing uses max-not-sum.</w:t>
+      </w:r>
+      <w:r>
+        <w:t xml:space="preserve"> </w:t>
+      </w:r>
+      <w:r>
+        <w:t xml:space="preserve">For a destination region, standby capacity is sized to the largest non-concurrent protected source workload portion, not the sum of all sources.</w:t>
+      </w:r>
+      <w:r>
+        <w:t xml:space="preserve"> </w:t>
+      </w:r>
+      <w:r>
+        <w:rPr>
+          <w:rStyle w:val="VerbatimChar"/>
+        </w:rPr>
+        <w:t xml:space="preserve">[Decided]</w:t>
+      </w:r>
+    </w:p>
+    <w:p>
+      <w:pPr>
+        <w:numPr>
+          <w:ilvl w:val="0"/>
+          <w:numId w:val="1002"/>
+        </w:numPr>
+      </w:pPr>
       <w:r>
         <w:rPr>
           <w:bCs/>
           <w:b/>
         </w:rPr>
-        <w:t xml:space="preserve">five-state machine</w:t>
-      </w:r>
-      <w:r>
-        <w:t xml:space="preserve"> </w:t>
-      </w:r>
-      <w:r>
-        <w:t xml:space="preserve">persisted in Cosmos DB with conditional writes, transition guards, and recovery tests — a production blocker until implemented:</w:t>
-      </w:r>
-      <w:r>
-        <w:t xml:space="preserve"> </w:t>
-      </w:r>
-      <w:r>
-        <w:rPr>
-          <w:rStyle w:val="VerbatimChar"/>
-        </w:rPr>
-        <w:t xml:space="preserve">[Documented]</w:t>
+        <w:t xml:space="preserve">SUM remains a conservative override.</w:t>
+      </w:r>
+      <w:r>
+        <w:t xml:space="preserve"> </w:t>
+      </w:r>
+      <w:r>
+        <w:t xml:space="preserve">If a customer contract, geography, or risk decision requires simultaneous source-region failure coverage, policy may switch that scope to SUM sizing.</w:t>
+      </w:r>
+      <w:r>
+        <w:t xml:space="preserve"> </w:t>
+      </w:r>
+      <w:r>
+        <w:rPr>
+          <w:rStyle w:val="VerbatimChar"/>
+        </w:rPr>
+        <w:t xml:space="preserve">[Decided]</w:t>
+      </w:r>
+    </w:p>
+    <w:p>
+      <w:pPr>
+        <w:numPr>
+          <w:ilvl w:val="0"/>
+          <w:numId w:val="1002"/>
+        </w:numPr>
+      </w:pPr>
+      <w:r>
+        <w:rPr>
+          <w:bCs/>
+          <w:b/>
+        </w:rPr>
+        <w:t xml:space="preserve">Every region can have three concurrent roles.</w:t>
+      </w:r>
+      <w:r>
+        <w:t xml:space="preserve"> </w:t>
+      </w:r>
+      <w:r>
+        <w:t xml:space="preserve">A region may host its own production, CVAL for customers whose production is elsewhere, and standby DR for customers from multiple source regions.</w:t>
+      </w:r>
+      <w:r>
+        <w:t xml:space="preserve"> </w:t>
+      </w:r>
+      <w:r>
+        <w:rPr>
+          <w:rStyle w:val="VerbatimChar"/>
+        </w:rPr>
+        <w:t xml:space="preserve">[Decided]</w:t>
+      </w:r>
+    </w:p>
+    <w:p>
+      <w:pPr>
+        <w:numPr>
+          <w:ilvl w:val="0"/>
+          <w:numId w:val="1002"/>
+        </w:numPr>
+      </w:pPr>
+      <w:r>
+        <w:rPr>
+          <w:bCs/>
+          <w:b/>
+        </w:rPr>
+        <w:t xml:space="preserve">CVAL is a DR capacity source, not free capacity.</w:t>
+      </w:r>
+      <w:r>
+        <w:t xml:space="preserve"> </w:t>
+      </w:r>
+      <w:r>
+        <w:t xml:space="preserve">CVAL capacity can be shut down, disassociated, or reassigned only on an authorised DR declaration and per approved priority/runbook.</w:t>
+      </w:r>
+      <w:r>
+        <w:t xml:space="preserve"> </w:t>
+      </w:r>
+      <w:r>
+        <w:rPr>
+          <w:rStyle w:val="VerbatimChar"/>
+        </w:rPr>
+        <w:t xml:space="preserve">[Decided]</w:t>
+      </w:r>
+    </w:p>
+    <w:p>
+      <w:pPr>
+        <w:numPr>
+          <w:ilvl w:val="0"/>
+          <w:numId w:val="1002"/>
+        </w:numPr>
+      </w:pPr>
+      <w:r>
+        <w:rPr>
+          <w:bCs/>
+          <w:b/>
+        </w:rPr>
+        <w:t xml:space="preserve">DR activation is per customer and priority wave.</w:t>
+      </w:r>
+      <w:r>
+        <w:t xml:space="preserve"> </w:t>
+      </w:r>
+      <w:r>
+        <w:t xml:space="preserve">A declared region failure changes engine mode, then ACRME activates the affected source region’s mapped standby instances from associated/inactive state to allocated/active state in approved business-priority waves.</w:t>
+      </w:r>
+      <w:r>
+        <w:t xml:space="preserve"> </w:t>
+      </w:r>
+      <w:r>
+        <w:rPr>
+          <w:rStyle w:val="VerbatimChar"/>
+        </w:rPr>
+        <w:t xml:space="preserve">[Decided]</w:t>
+      </w:r>
+    </w:p>
+    <w:p>
+      <w:pPr>
+        <w:numPr>
+          <w:ilvl w:val="0"/>
+          <w:numId w:val="1002"/>
+        </w:numPr>
+      </w:pPr>
+      <w:r>
+        <w:rPr>
+          <w:bCs/>
+          <w:b/>
+        </w:rPr>
+        <w:t xml:space="preserve">Failback is reversible and audited.</w:t>
+      </w:r>
+      <w:r>
+        <w:t xml:space="preserve"> </w:t>
+      </w:r>
+      <w:r>
+        <w:t xml:space="preserve">Every activation records customer state, source/destination, capacity acquisition path, approvals, and rollback/failback checkpoint.</w:t>
+      </w:r>
+      <w:r>
+        <w:t xml:space="preserve"> </w:t>
+      </w:r>
+      <w:r>
+        <w:rPr>
+          <w:rStyle w:val="VerbatimChar"/>
+        </w:rPr>
+        <w:t xml:space="preserve">[Decided]</w:t>
+      </w:r>
+    </w:p>
+    <w:bookmarkEnd w:id="21"/>
+    <w:bookmarkStart w:id="22" w:name="distributed-dr-reference-model"/>
+    <w:p>
+      <w:pPr>
+        <w:pStyle w:val="Heading2"/>
+      </w:pPr>
+      <w:r>
+        <w:t xml:space="preserve">Distributed DR Reference Model</w:t>
+      </w:r>
+    </w:p>
+    <w:p>
+      <w:pPr>
+        <w:pStyle w:val="FirstParagraph"/>
+      </w:pPr>
+      <w:r>
+        <w:t xml:space="preserve">The authoritative mapping is</w:t>
+      </w:r>
+      <w:r>
+        <w:t xml:space="preserve"> </w:t>
+      </w:r>
+      <w:r>
+        <w:rPr>
+          <w:rStyle w:val="VerbatimChar"/>
+        </w:rPr>
+        <w:t xml:space="preserve">SourceDestinationDRIndex</w:t>
+      </w:r>
+      <w:r>
+        <w:t xml:space="preserve">:</w:t>
+      </w:r>
+    </w:p>
+    <w:tbl>
+      <w:tblPr>
+        <w:tblStyle w:val="Table"/>
+        <w:tblW w:type="pct" w:w="5000"/>
+        <w:tblLook w:firstRow="1" w:lastRow="0" w:firstColumn="0" w:lastColumn="0" w:noHBand="0" w:noVBand="0" w:val="0020"/>
+      </w:tblPr>
+      <w:tblGrid>
+        <w:gridCol w:w="3960"/>
+        <w:gridCol w:w="3960"/>
+      </w:tblGrid>
+      <w:tr>
+        <w:trPr>
+          <w:tblHeader w:val="true"/>
+        </w:trPr>
+        <w:tc>
+          <w:tcPr/>
+          <w:p>
+            <w:pPr>
+              <w:pStyle w:val="Compact"/>
+              <w:jc w:val="left"/>
+            </w:pPr>
+            <w:r>
+              <w:t xml:space="preserve">Field</w:t>
+            </w:r>
+          </w:p>
+        </w:tc>
+        <w:tc>
+          <w:tcPr/>
+          <w:p>
+            <w:pPr>
+              <w:pStyle w:val="Compact"/>
+              <w:jc w:val="left"/>
+            </w:pPr>
+            <w:r>
+              <w:t xml:space="preserve">Purpose</w:t>
+            </w:r>
+          </w:p>
+        </w:tc>
+      </w:tr>
+      <w:tr>
+        <w:tc>
+          <w:tcPr/>
+          <w:p>
+            <w:pPr>
+              <w:pStyle w:val="Compact"/>
+              <w:jc w:val="left"/>
+            </w:pPr>
+            <w:r>
+              <w:rPr>
+                <w:rStyle w:val="VerbatimChar"/>
+              </w:rPr>
+              <w:t xml:space="preserve">source_region</w:t>
+            </w:r>
+          </w:p>
+        </w:tc>
+        <w:tc>
+          <w:tcPr/>
+          <w:p>
+            <w:pPr>
+              <w:pStyle w:val="Compact"/>
+              <w:jc w:val="left"/>
+            </w:pPr>
+            <w:r>
+              <w:t xml:space="preserve">Failed or protected production source.</w:t>
+            </w:r>
+          </w:p>
+        </w:tc>
+      </w:tr>
+      <w:tr>
+        <w:tc>
+          <w:tcPr/>
+          <w:p>
+            <w:pPr>
+              <w:pStyle w:val="Compact"/>
+              <w:jc w:val="left"/>
+            </w:pPr>
+            <w:r>
+              <w:rPr>
+                <w:rStyle w:val="VerbatimChar"/>
+              </w:rPr>
+              <w:t xml:space="preserve">destination_region</w:t>
+            </w:r>
+          </w:p>
+        </w:tc>
+        <w:tc>
+          <w:tcPr/>
+          <w:p>
+            <w:pPr>
+              <w:pStyle w:val="Compact"/>
+              <w:jc w:val="left"/>
+            </w:pPr>
+            <w:r>
+              <w:t xml:space="preserve">Region holding standby DR capacity.</w:t>
+            </w:r>
+          </w:p>
+        </w:tc>
+      </w:tr>
+      <w:tr>
+        <w:tc>
+          <w:tcPr/>
+          <w:p>
+            <w:pPr>
+              <w:pStyle w:val="Compact"/>
+              <w:jc w:val="left"/>
+            </w:pPr>
+            <w:r>
+              <w:rPr>
+                <w:rStyle w:val="VerbatimChar"/>
+              </w:rPr>
+              <w:t xml:space="preserve">customer_or_realm_id</w:t>
+            </w:r>
+          </w:p>
+        </w:tc>
+        <w:tc>
+          <w:tcPr/>
+          <w:p>
+            <w:pPr>
+              <w:pStyle w:val="Compact"/>
+              <w:jc w:val="left"/>
+            </w:pPr>
+            <w:r>
+              <w:t xml:space="preserve">Customer/realm whose standby set is mapped.</w:t>
+            </w:r>
+          </w:p>
+        </w:tc>
+      </w:tr>
+      <w:tr>
+        <w:tc>
+          <w:tcPr/>
+          <w:p>
+            <w:pPr>
+              <w:pStyle w:val="Compact"/>
+              <w:jc w:val="left"/>
+            </w:pPr>
+            <w:r>
+              <w:rPr>
+                <w:rStyle w:val="VerbatimChar"/>
+              </w:rPr>
+              <w:t xml:space="preserve">seed_id</w:t>
+            </w:r>
+          </w:p>
+        </w:tc>
+        <w:tc>
+          <w:tcPr/>
+          <w:p>
+            <w:pPr>
+              <w:pStyle w:val="Compact"/>
+              <w:jc w:val="left"/>
+            </w:pPr>
+            <w:r>
+              <w:t xml:space="preserve">Link back to</w:t>
+            </w:r>
+            <w:r>
+              <w:t xml:space="preserve"> </w:t>
+            </w:r>
+            <w:r>
+              <w:rPr>
+                <w:rStyle w:val="VerbatimChar"/>
+              </w:rPr>
+              <w:t xml:space="preserve">CustomerSeedRecord</w:t>
+            </w:r>
+            <w:r>
+              <w:t xml:space="preserve"> </w:t>
+            </w:r>
+            <w:r>
+              <w:t xml:space="preserve">from ADR-001.</w:t>
+            </w:r>
+          </w:p>
+        </w:tc>
+      </w:tr>
+      <w:tr>
+        <w:tc>
+          <w:tcPr/>
+          <w:p>
+            <w:pPr>
+              <w:pStyle w:val="Compact"/>
+              <w:jc w:val="left"/>
+            </w:pPr>
+            <w:r>
+              <w:rPr>
+                <w:rStyle w:val="VerbatimChar"/>
+              </w:rPr>
+              <w:t xml:space="preserve">standby_instance_set</w:t>
+            </w:r>
+          </w:p>
+        </w:tc>
+        <w:tc>
+          <w:tcPr/>
+          <w:p>
+            <w:pPr>
+              <w:pStyle w:val="Compact"/>
+              <w:jc w:val="left"/>
+            </w:pPr>
+            <w:r>
+              <w:t xml:space="preserve">VM/VMSS/node-pool/application set eligible for activation.</w:t>
+            </w:r>
+          </w:p>
+        </w:tc>
+      </w:tr>
+      <w:tr>
+        <w:tc>
+          <w:tcPr/>
+          <w:p>
+            <w:pPr>
+              <w:pStyle w:val="Compact"/>
+              <w:jc w:val="left"/>
+            </w:pPr>
+            <w:r>
+              <w:rPr>
+                <w:rStyle w:val="VerbatimChar"/>
+              </w:rPr>
+              <w:t xml:space="preserve">sku_family</w:t>
+            </w:r>
+            <w:r>
+              <w:t xml:space="preserve">,</w:t>
+            </w:r>
+            <w:r>
+              <w:t xml:space="preserve"> </w:t>
+            </w:r>
+            <w:r>
+              <w:rPr>
+                <w:rStyle w:val="VerbatimChar"/>
+              </w:rPr>
+              <w:t xml:space="preserve">sku</w:t>
+            </w:r>
+            <w:r>
+              <w:t xml:space="preserve">,</w:t>
+            </w:r>
+            <w:r>
+              <w:t xml:space="preserve"> </w:t>
+            </w:r>
+            <w:r>
+              <w:rPr>
+                <w:rStyle w:val="VerbatimChar"/>
+              </w:rPr>
+              <w:t xml:space="preserve">zone</w:t>
+            </w:r>
+            <w:r>
+              <w:t xml:space="preserve">,</w:t>
+            </w:r>
+            <w:r>
+              <w:t xml:space="preserve"> </w:t>
+            </w:r>
+            <w:r>
+              <w:rPr>
+                <w:rStyle w:val="VerbatimChar"/>
+              </w:rPr>
+              <w:t xml:space="preserve">quantity</w:t>
+            </w:r>
+          </w:p>
+        </w:tc>
+        <w:tc>
+          <w:tcPr/>
+          <w:p>
+            <w:pPr>
+              <w:pStyle w:val="Compact"/>
+              <w:jc w:val="left"/>
+            </w:pPr>
+            <w:r>
+              <w:t xml:space="preserve">Capacity/quota dimensions.</w:t>
+            </w:r>
+          </w:p>
+        </w:tc>
+      </w:tr>
+      <w:tr>
+        <w:tc>
+          <w:tcPr/>
+          <w:p>
+            <w:pPr>
+              <w:pStyle w:val="Compact"/>
+              <w:jc w:val="left"/>
+            </w:pPr>
+            <w:r>
+              <w:rPr>
+                <w:rStyle w:val="VerbatimChar"/>
+              </w:rPr>
+              <w:t xml:space="preserve">activation_state</w:t>
+            </w:r>
+          </w:p>
+        </w:tc>
+        <w:tc>
+          <w:tcPr/>
+          <w:p>
+            <w:pPr>
+              <w:pStyle w:val="Compact"/>
+              <w:jc w:val="left"/>
+            </w:pPr>
+            <w:r>
+              <w:rPr>
+                <w:rStyle w:val="VerbatimChar"/>
+              </w:rPr>
+              <w:t xml:space="preserve">standby</w:t>
+            </w:r>
+            <w:r>
+              <w:t xml:space="preserve">,</w:t>
+            </w:r>
+            <w:r>
+              <w:t xml:space="preserve"> </w:t>
+            </w:r>
+            <w:r>
+              <w:rPr>
+                <w:rStyle w:val="VerbatimChar"/>
+              </w:rPr>
+              <w:t xml:space="preserve">activation_pending</w:t>
+            </w:r>
+            <w:r>
+              <w:t xml:space="preserve">,</w:t>
+            </w:r>
+            <w:r>
+              <w:t xml:space="preserve"> </w:t>
+            </w:r>
+            <w:r>
+              <w:rPr>
+                <w:rStyle w:val="VerbatimChar"/>
+              </w:rPr>
+              <w:t xml:space="preserve">active</w:t>
+            </w:r>
+            <w:r>
+              <w:t xml:space="preserve">,</w:t>
+            </w:r>
+            <w:r>
+              <w:t xml:space="preserve"> </w:t>
+            </w:r>
+            <w:r>
+              <w:rPr>
+                <w:rStyle w:val="VerbatimChar"/>
+              </w:rPr>
+              <w:t xml:space="preserve">failback_pending</w:t>
+            </w:r>
+            <w:r>
+              <w:t xml:space="preserve">,</w:t>
+            </w:r>
+            <w:r>
+              <w:t xml:space="preserve"> </w:t>
+            </w:r>
+            <w:r>
+              <w:rPr>
+                <w:rStyle w:val="VerbatimChar"/>
+              </w:rPr>
+              <w:t xml:space="preserve">returned</w:t>
+            </w:r>
+            <w:r>
+              <w:t xml:space="preserve">.</w:t>
+            </w:r>
+          </w:p>
+        </w:tc>
+      </w:tr>
+      <w:tr>
+        <w:tc>
+          <w:tcPr/>
+          <w:p>
+            <w:pPr>
+              <w:pStyle w:val="Compact"/>
+              <w:jc w:val="left"/>
+            </w:pPr>
+            <w:r>
+              <w:rPr>
+                <w:rStyle w:val="VerbatimChar"/>
+              </w:rPr>
+              <w:t xml:space="preserve">priority_wave</w:t>
+            </w:r>
+          </w:p>
+        </w:tc>
+        <w:tc>
+          <w:tcPr/>
+          <w:p>
+            <w:pPr>
+              <w:pStyle w:val="Compact"/>
+              <w:jc w:val="left"/>
+            </w:pPr>
+            <w:r>
+              <w:t xml:space="preserve">Business priority for activation order.</w:t>
+            </w:r>
+          </w:p>
+        </w:tc>
+      </w:tr>
+      <w:tr>
+        <w:tc>
+          <w:tcPr/>
+          <w:p>
+            <w:pPr>
+              <w:pStyle w:val="Compact"/>
+              <w:jc w:val="left"/>
+            </w:pPr>
+            <w:r>
+              <w:rPr>
+                <w:rStyle w:val="VerbatimChar"/>
+              </w:rPr>
+              <w:t xml:space="preserve">policy_version</w:t>
+            </w:r>
+            <w:r>
+              <w:t xml:space="preserve">,</w:t>
+            </w:r>
+            <w:r>
+              <w:t xml:space="preserve"> </w:t>
+            </w:r>
+            <w:r>
+              <w:rPr>
+                <w:rStyle w:val="VerbatimChar"/>
+              </w:rPr>
+              <w:t xml:space="preserve">last_updated</w:t>
+            </w:r>
+          </w:p>
+        </w:tc>
+        <w:tc>
+          <w:tcPr/>
+          <w:p>
+            <w:pPr>
+              <w:pStyle w:val="Compact"/>
+              <w:jc w:val="left"/>
+            </w:pPr>
+            <w:r>
+              <w:t xml:space="preserve">Replay, freshness, and audit fields.</w:t>
+            </w:r>
+          </w:p>
+        </w:tc>
+      </w:tr>
+    </w:tbl>
+    <w:p>
+      <w:pPr>
+        <w:pStyle w:val="BodyText"/>
+      </w:pPr>
+      <w:r>
+        <w:t xml:space="preserve">The index must be queryable in both directions:</w:t>
+      </w:r>
+    </w:p>
+    <w:p>
+      <w:pPr>
+        <w:numPr>
+          <w:ilvl w:val="0"/>
+          <w:numId w:val="1003"/>
+        </w:numPr>
+        <w:pStyle w:val="Compact"/>
+      </w:pPr>
+      <w:r>
+        <w:t xml:space="preserve">source -&gt; destinations, to know where a failed region’s customers activate;</w:t>
+      </w:r>
+    </w:p>
+    <w:p>
+      <w:pPr>
+        <w:numPr>
+          <w:ilvl w:val="0"/>
+          <w:numId w:val="1003"/>
+        </w:numPr>
+        <w:pStyle w:val="Compact"/>
+      </w:pPr>
+      <w:r>
+        <w:t xml:space="preserve">destination -&gt; sources, to compute max-source coverage and dashboard exposure.</w:t>
+      </w:r>
+      <w:r>
+        <w:t xml:space="preserve"> </w:t>
+      </w:r>
+      <w:r>
+        <w:rPr>
+          <w:rStyle w:val="VerbatimChar"/>
+        </w:rPr>
+        <w:t xml:space="preserve">[Decided]</w:t>
+      </w:r>
+    </w:p>
+    <w:bookmarkEnd w:id="22"/>
+    <w:bookmarkStart w:id="23" w:name="dr-sizing-formula"/>
+    <w:p>
+      <w:pPr>
+        <w:pStyle w:val="Heading2"/>
+      </w:pPr>
+      <w:r>
+        <w:t xml:space="preserve">DR Sizing Formula</w:t>
+      </w:r>
+    </w:p>
+    <w:p>
+      <w:pPr>
+        <w:pStyle w:val="FirstParagraph"/>
+      </w:pPr>
+      <w:r>
+        <w:t xml:space="preserve">For each destination, SKU, zone, and policy scope:</w:t>
+      </w:r>
+    </w:p>
+    <w:p>
+      <w:pPr>
+        <w:pStyle w:val="SourceCode"/>
+      </w:pPr>
+      <w:r>
+        <w:rPr>
+          <w:rStyle w:val="VerbatimChar"/>
+        </w:rPr>
+        <w:t xml:space="preserve">Destination_DR_Requirement(d)</w:t>
+      </w:r>
+      <w:r>
+        <w:br/>
+      </w:r>
+      <w:r>
+        <w:rPr>
+          <w:rStyle w:val="VerbatimChar"/>
+        </w:rPr>
+        <w:t xml:space="preserve">  = MAX over non-concurrent source regions s protected by d (</w:t>
+      </w:r>
+      <w:r>
+        <w:br/>
+      </w:r>
+      <w:r>
+        <w:rPr>
+          <w:rStyle w:val="VerbatimChar"/>
+        </w:rPr>
+        <w:t xml:space="preserve">      Workload_Portion(s -&gt; d)</w:t>
+      </w:r>
+      <w:r>
+        <w:br/>
+      </w:r>
+      <w:r>
+        <w:rPr>
+          <w:rStyle w:val="VerbatimChar"/>
+        </w:rPr>
+        <w:t xml:space="preserve">    )</w:t>
+      </w:r>
+    </w:p>
+    <w:p>
+      <w:pPr>
+        <w:pStyle w:val="FirstParagraph"/>
+      </w:pPr>
+      <w:r>
+        <w:t xml:space="preserve">With vCPU expansion:</w:t>
+      </w:r>
+    </w:p>
+    <w:p>
+      <w:pPr>
+        <w:pStyle w:val="SourceCode"/>
+      </w:pPr>
+      <w:r>
+        <w:rPr>
+          <w:rStyle w:val="VerbatimChar"/>
+        </w:rPr>
+        <w:t xml:space="preserve">DR_Floor_vCPU(d, sku, zone)</w:t>
+      </w:r>
+      <w:r>
+        <w:br/>
+      </w:r>
+      <w:r>
+        <w:rPr>
+          <w:rStyle w:val="VerbatimChar"/>
+        </w:rPr>
+        <w:t xml:space="preserve">  = Destination_DR_Requirement(d, sku, zone) * vCPU_Per_Instance(sku)</w:t>
+      </w:r>
+    </w:p>
+    <w:p>
+      <w:pPr>
+        <w:pStyle w:val="FirstParagraph"/>
+      </w:pPr>
+      <w:r>
+        <w:t xml:space="preserve">The old formula</w:t>
+      </w:r>
+      <w:r>
+        <w:t xml:space="preserve"> </w:t>
+      </w:r>
+      <w:r>
+        <w:rPr>
+          <w:rStyle w:val="VerbatimChar"/>
+        </w:rPr>
+        <w:t xml:space="preserve">prod_vm_count * dr_ratio_max</w:t>
+      </w:r>
+      <w:r>
+        <w:t xml:space="preserve"> </w:t>
+      </w:r>
+      <w:r>
+        <w:t xml:space="preserve">is superseded. It may appear only in legacy examples, never as the default production sizing rule.</w:t>
+      </w:r>
+      <w:r>
+        <w:t xml:space="preserve"> </w:t>
+      </w:r>
+      <w:r>
+        <w:rPr>
+          <w:rStyle w:val="VerbatimChar"/>
+        </w:rPr>
+        <w:t xml:space="preserve">[Decided]</w:t>
+      </w:r>
+    </w:p>
+    <w:p>
+      <w:pPr>
+        <w:pStyle w:val="BodyText"/>
+      </w:pPr>
+      <w:r>
+        <w:rPr>
+          <w:bCs/>
+          <w:b/>
+        </w:rPr>
+        <w:t xml:space="preserve">Zone-distribution interaction (PLC-011, Appendix A.9) — cross-reference.</w:t>
+      </w:r>
+      <w:r>
+        <w:t xml:space="preserve"> </w:t>
+      </w:r>
+      <w:r>
+        <w:t xml:space="preserve">Because the DR floor above is computed</w:t>
+      </w:r>
+      <w:r>
+        <w:t xml:space="preserve"> </w:t>
+      </w:r>
+      <w:r>
+        <w:rPr>
+          <w:bCs/>
+          <w:b/>
+        </w:rPr>
+        <w:t xml:space="preserve">per zone</w:t>
+      </w:r>
+      <w:r>
+        <w:t xml:space="preserve">, the per-zone</w:t>
+      </w:r>
+      <w:r>
+        <w:t xml:space="preserve"> </w:t>
+      </w:r>
+      <w:r>
+        <w:rPr>
+          <w:rStyle w:val="VerbatimChar"/>
+        </w:rPr>
+        <w:t xml:space="preserve">Workload_Portion(s → d)</w:t>
+      </w:r>
+      <w:r>
+        <w:t xml:space="preserve"> </w:t>
+      </w:r>
+      <w:r>
+        <w:t xml:space="preserve">values depend on how each source workload is spread across its availability zones. Under</w:t>
+      </w:r>
+      <w:r>
+        <w:t xml:space="preserve"> </w:t>
+      </w:r>
+      <w:r>
+        <w:rPr>
+          <w:bCs/>
+          <w:b/>
+        </w:rPr>
+        <w:t xml:space="preserve">PLC-011</w:t>
+      </w:r>
+      <w:r>
+        <w:t xml:space="preserve"> </w:t>
+      </w:r>
+      <w:r>
+        <w:t xml:space="preserve">placement targets an</w:t>
+      </w:r>
+      <w:r>
+        <w:t xml:space="preserve"> </w:t>
+      </w:r>
+      <w:r>
+        <w:rPr>
+          <w:bCs/>
+          <w:b/>
+        </w:rPr>
+        <w:t xml:space="preserve">even ≈</w:t>
+      </w:r>
+      <w:r>
+        <w:rPr>
+          <w:bCs/>
+          <w:b/>
+        </w:rPr>
+        <w:t xml:space="preserve"> </w:t>
+      </w:r>
+      <w:r>
+        <w:rPr>
+          <w:rStyle w:val="VerbatimChar"/>
+          <w:bCs/>
+          <w:b/>
+        </w:rPr>
+        <w:t xml:space="preserve">1/zone_count</w:t>
+      </w:r>
+      <w:r>
+        <w:rPr>
+          <w:bCs/>
+          <w:b/>
+        </w:rPr>
+        <w:t xml:space="preserve"> </w:t>
+      </w:r>
+      <w:r>
+        <w:rPr>
+          <w:bCs/>
+          <w:b/>
+        </w:rPr>
+        <w:t xml:space="preserve">spread</w:t>
+      </w:r>
+      <w:r>
+        <w:t xml:space="preserve"> </w:t>
+      </w:r>
+      <w:r>
+        <w:t xml:space="preserve">of a workload’s VMs across zones (≈ 33% each in a three-zone region), and raises a</w:t>
+      </w:r>
+      <w:r>
+        <w:t xml:space="preserve"> </w:t>
+      </w:r>
+      <w:r>
+        <w:rPr>
+          <w:bCs/>
+          <w:b/>
+        </w:rPr>
+        <w:t xml:space="preserve">rebalancing action</w:t>
+      </w:r>
+      <w:r>
+        <w:t xml:space="preserve"> </w:t>
+      </w:r>
+      <w:r>
+        <w:t xml:space="preserve">when a deployment or growth event skews distribution beyond the configured tolerance (C-13); see</w:t>
+      </w:r>
+      <w:r>
+        <w:t xml:space="preserve"> </w:t>
+      </w:r>
+      <w:r>
+        <w:rPr>
+          <w:bCs/>
+          <w:b/>
+        </w:rPr>
+        <w:t xml:space="preserve">Appendix A.9</w:t>
+      </w:r>
+      <w:r>
+        <w:t xml:space="preserve"> </w:t>
+      </w:r>
+      <w:r>
+        <w:t xml:space="preserve">of the baseline for the skew formula. Two consequences for DR sizing: (a) an</w:t>
+      </w:r>
+      <w:r>
+        <w:t xml:space="preserve"> </w:t>
+      </w:r>
+      <w:r>
+        <w:rPr>
+          <w:bCs/>
+          <w:b/>
+        </w:rPr>
+        <w:t xml:space="preserve">even source distribution</w:t>
+      </w:r>
+      <w:r>
+        <w:t xml:space="preserve"> </w:t>
+      </w:r>
+      <w:r>
+        <w:t xml:space="preserve">keeps the per-zone</w:t>
+      </w:r>
+      <w:r>
+        <w:t xml:space="preserve"> </w:t>
+      </w:r>
+      <w:r>
+        <w:rPr>
+          <w:rStyle w:val="VerbatimChar"/>
+        </w:rPr>
+        <w:t xml:space="preserve">Destination_DR_Requirement(d, sku, zone)</w:t>
+      </w:r>
+      <w:r>
+        <w:t xml:space="preserve"> </w:t>
+      </w:r>
+      <w:r>
+        <w:t xml:space="preserve">balanced, so no single destination zone carries a disproportionate max-not-sum floor; and (b) the resulting per-zone DR reservations are held in the destination’s</w:t>
+      </w:r>
+      <w:r>
+        <w:t xml:space="preserve"> </w:t>
+      </w:r>
+      <w:r>
+        <w:rPr>
+          <w:bCs/>
+          <w:b/>
+        </w:rPr>
+        <w:t xml:space="preserve">per-AZ CRGs (CAP-023)</w:t>
+      </w:r>
+      <w:r>
+        <w:t xml:space="preserve"> </w:t>
+      </w:r>
+      <w:r>
+        <w:t xml:space="preserve">— the per-AZ CRG for each zone sizes to that zone’s DR floor, and the regional CRG holds only SKUs without zonal reservation support. A skewed source distribution therefore inflates one destination zone’s DR floor; the PLC-011 rebalancing action is the corrective control, and DR sizing consumes the (rebalanced) per-zone portions rather than re-deriving distribution.</w:t>
+      </w:r>
+      <w:r>
+        <w:t xml:space="preserve"> </w:t>
+      </w:r>
+      <w:r>
+        <w:rPr>
+          <w:rStyle w:val="VerbatimChar"/>
+        </w:rPr>
+        <w:t xml:space="preserve">[Derived]</w:t>
+      </w:r>
+    </w:p>
+    <w:bookmarkEnd w:id="23"/>
+    <w:bookmarkStart w:id="24" w:name="dr-activation-sequence"/>
+    <w:p>
+      <w:pPr>
+        <w:pStyle w:val="Heading2"/>
+      </w:pPr>
+      <w:r>
+        <w:t xml:space="preserve">DR Activation Sequence</w:t>
+      </w:r>
+    </w:p>
+    <w:p>
+      <w:pPr>
+        <w:pStyle w:val="SourceCode"/>
+      </w:pPr>
+      <w:r>
+        <w:rPr>
+          <w:rStyle w:val="VerbatimChar"/>
+        </w:rPr>
+        <w:t xml:space="preserve">flowchart TD</w:t>
+      </w:r>
+      <w:r>
+        <w:br/>
+      </w:r>
+      <w:r>
+        <w:rPr>
+          <w:rStyle w:val="VerbatimChar"/>
+        </w:rPr>
+        <w:t xml:space="preserve">    Declare[Authorised DR declaration] --&gt; Mode[Set DR_EVENT_ACTIVE]</w:t>
+      </w:r>
+      <w:r>
+        <w:br/>
+      </w:r>
+      <w:r>
+        <w:rPr>
+          <w:rStyle w:val="VerbatimChar"/>
+        </w:rPr>
+        <w:t xml:space="preserve">    Mode --&gt; Index[Read SourceDestinationDRIndex]</w:t>
+      </w:r>
+      <w:r>
+        <w:br/>
+      </w:r>
+      <w:r>
+        <w:rPr>
+          <w:rStyle w:val="VerbatimChar"/>
+        </w:rPr>
+        <w:t xml:space="preserve">    Index --&gt; Waves[Order customers by priority wave]</w:t>
+      </w:r>
+      <w:r>
+        <w:br/>
+      </w:r>
+      <w:r>
+        <w:rPr>
+          <w:rStyle w:val="VerbatimChar"/>
+        </w:rPr>
+        <w:t xml:space="preserve">    Waves --&gt; Bootstrap[Use bootstrap capacity]</w:t>
+      </w:r>
+      <w:r>
+        <w:br/>
+      </w:r>
+      <w:r>
+        <w:rPr>
+          <w:rStyle w:val="VerbatimChar"/>
+        </w:rPr>
+        <w:t xml:space="preserve">    Bootstrap --&gt; Quota[Use available destination quota]</w:t>
+      </w:r>
+      <w:r>
+        <w:br/>
+      </w:r>
+      <w:r>
+        <w:rPr>
+          <w:rStyle w:val="VerbatimChar"/>
+        </w:rPr>
+        <w:t xml:space="preserve">    Quota --&gt; CVAL[Release approved CVAL earmark]</w:t>
+      </w:r>
+      <w:r>
+        <w:br/>
+      </w:r>
+      <w:r>
+        <w:rPr>
+          <w:rStyle w:val="VerbatimChar"/>
+        </w:rPr>
+        <w:t xml:space="preserve">    CVAL --&gt; Share[Use approved shared reservation]</w:t>
+      </w:r>
+      <w:r>
+        <w:br/>
+      </w:r>
+      <w:r>
+        <w:rPr>
+          <w:rStyle w:val="VerbatimChar"/>
+        </w:rPr>
+        <w:t xml:space="preserve">    Share --&gt; Pool[Allocate pooled quota]</w:t>
+      </w:r>
+      <w:r>
+        <w:br/>
+      </w:r>
+      <w:r>
+        <w:rPr>
+          <w:rStyle w:val="VerbatimChar"/>
+        </w:rPr>
+        <w:t xml:space="preserve">    Pool --&gt; AzureReq[Submit Azure request if still deficient]</w:t>
+      </w:r>
+      <w:r>
+        <w:br/>
+      </w:r>
+      <w:r>
+        <w:rPr>
+          <w:rStyle w:val="VerbatimChar"/>
+        </w:rPr>
+        <w:t xml:space="preserve">    AzureReq --&gt; Activate[Transition standby associated to allocated active]</w:t>
+      </w:r>
+      <w:r>
+        <w:br/>
+      </w:r>
+      <w:r>
+        <w:rPr>
+          <w:rStyle w:val="VerbatimChar"/>
+        </w:rPr>
+        <w:t xml:space="preserve">    Activate --&gt; Audit[Record activation and failback checkpoint]</w:t>
+      </w:r>
+    </w:p>
+    <w:p>
+      <w:pPr>
+        <w:pStyle w:val="FirstParagraph"/>
+      </w:pPr>
+      <w:r>
+        <w:t xml:space="preserve">Capacity acquisition order:</w:t>
+      </w:r>
+    </w:p>
+    <w:p>
+      <w:pPr>
+        <w:numPr>
+          <w:ilvl w:val="0"/>
+          <w:numId w:val="1004"/>
+        </w:numPr>
+        <w:pStyle w:val="Compact"/>
+      </w:pPr>
+      <w:r>
+        <w:t xml:space="preserve">existing bootstrap capacity;</w:t>
+      </w:r>
+    </w:p>
+    <w:p>
+      <w:pPr>
+        <w:numPr>
+          <w:ilvl w:val="0"/>
+          <w:numId w:val="1004"/>
+        </w:numPr>
+        <w:pStyle w:val="Compact"/>
+      </w:pPr>
+      <w:r>
+        <w:t xml:space="preserve">available destination quota/capacity;</w:t>
+      </w:r>
+    </w:p>
+    <w:p>
+      <w:pPr>
+        <w:numPr>
+          <w:ilvl w:val="0"/>
+          <w:numId w:val="1004"/>
+        </w:numPr>
+        <w:pStyle w:val="Compact"/>
+      </w:pPr>
+      <w:r>
+        <w:t xml:space="preserve">approved CVAL release;</w:t>
+      </w:r>
+    </w:p>
+    <w:p>
+      <w:pPr>
+        <w:numPr>
+          <w:ilvl w:val="0"/>
+          <w:numId w:val="1004"/>
+        </w:numPr>
+        <w:pStyle w:val="Compact"/>
+      </w:pPr>
+      <w:r>
+        <w:t xml:space="preserve">approved capacity sharing;</w:t>
+      </w:r>
+    </w:p>
+    <w:p>
+      <w:pPr>
+        <w:numPr>
+          <w:ilvl w:val="0"/>
+          <w:numId w:val="1004"/>
+        </w:numPr>
+        <w:pStyle w:val="Compact"/>
+      </w:pPr>
+      <w:r>
+        <w:t xml:space="preserve">pooled quota allocation;</w:t>
+      </w:r>
+    </w:p>
+    <w:p>
+      <w:pPr>
+        <w:numPr>
+          <w:ilvl w:val="0"/>
+          <w:numId w:val="1004"/>
+        </w:numPr>
+        <w:pStyle w:val="Compact"/>
+      </w:pPr>
+      <w:r>
+        <w:t xml:space="preserve">Azure quota/capacity request with exposed deficit if Azure cannot supply it.</w:t>
+      </w:r>
+      <w:r>
+        <w:t xml:space="preserve"> </w:t>
+      </w:r>
+      <w:r>
+        <w:rPr>
+          <w:rStyle w:val="VerbatimChar"/>
+        </w:rPr>
+        <w:t xml:space="preserve">[Decided]</w:t>
+      </w:r>
+    </w:p>
+    <w:bookmarkEnd w:id="24"/>
+    <w:bookmarkStart w:id="25" w:name="cval-earmark-and-no-double-count-rule"/>
+    <w:p>
+      <w:pPr>
+        <w:pStyle w:val="Heading2"/>
+      </w:pPr>
+      <w:r>
+        <w:t xml:space="preserve">CVAL Earmark and No-Double-Count Rule</w:t>
+      </w:r>
+    </w:p>
+    <w:p>
+      <w:pPr>
+        <w:pStyle w:val="FirstParagraph"/>
+      </w:pPr>
+      <w:r>
+        <w:t xml:space="preserve">When CVAL and DR co-locate, ACRME must create a</w:t>
+      </w:r>
+      <w:r>
+        <w:t xml:space="preserve"> </w:t>
+      </w:r>
+      <w:r>
+        <w:rPr>
+          <w:rStyle w:val="VerbatimChar"/>
+        </w:rPr>
+        <w:t xml:space="preserve">CVALEarmarkRecord</w:t>
+      </w:r>
+      <w:r>
+        <w:t xml:space="preserve"> </w:t>
+      </w:r>
+      <w:r>
+        <w:t xml:space="preserve">that identifies which CVAL capacity is releasable for a customer’s DR activation. Earmarked CVAL capacity counts toward DR headroom, not live CVAL headroom. It must never be credited as both live CVAL capacity and available DR capacity.</w:t>
+      </w:r>
+      <w:r>
+        <w:t xml:space="preserve"> </w:t>
+      </w:r>
+      <w:r>
+        <w:rPr>
+          <w:rStyle w:val="VerbatimChar"/>
+        </w:rPr>
+        <w:t xml:space="preserve">[Decided]</w:t>
+      </w:r>
+    </w:p>
+    <w:p>
+      <w:pPr>
+        <w:pStyle w:val="BodyText"/>
+      </w:pPr>
+      <w:r>
+        <w:rPr>
+          <w:rStyle w:val="VerbatimChar"/>
+        </w:rPr>
+        <w:t xml:space="preserve">CVALEarmarkRecord</w:t>
+      </w:r>
+      <w:r>
+        <w:t xml:space="preserve"> </w:t>
+      </w:r>
+      <w:r>
+        <w:t xml:space="preserve">contains customer/realm, CVAL region, DR destination, SKU/zone/quantity, release action, approval policy, priority wave, expiry/review status, and audit references.</w:t>
+      </w:r>
+      <w:r>
+        <w:t xml:space="preserve"> </w:t>
+      </w:r>
+      <w:r>
+        <w:rPr>
+          <w:rStyle w:val="VerbatimChar"/>
+        </w:rPr>
+        <w:t xml:space="preserve">[Decided]</w:t>
+      </w:r>
+    </w:p>
+    <w:bookmarkEnd w:id="25"/>
+    <w:bookmarkStart w:id="26" w:name="engine-state-machine"/>
+    <w:p>
+      <w:pPr>
+        <w:pStyle w:val="Heading2"/>
+      </w:pPr>
+      <w:r>
+        <w:t xml:space="preserve">Engine State Machine</w:t>
+      </w:r>
+    </w:p>
+    <w:p>
+      <w:pPr>
+        <w:pStyle w:val="FirstParagraph"/>
+      </w:pPr>
+      <w:r>
+        <w:rPr>
+          <w:rStyle w:val="VerbatimChar"/>
+        </w:rPr>
+        <w:t xml:space="preserve">engine_mode</w:t>
+      </w:r>
+      <w:r>
+        <w:t xml:space="preserve"> </w:t>
+      </w:r>
+      <w:r>
+        <w:t xml:space="preserve">is a persisted state machine with conditional writes and operator-gated transitions:</w:t>
       </w:r>
     </w:p>
     <w:tbl>
@@ -1135,8 +1902,7 @@
             </w:pPr>
             <w:r>
               <w:rPr>
-                <w:bCs/>
-                <w:b/>
+                <w:rStyle w:val="VerbatimChar"/>
               </w:rPr>
               <w:t xml:space="preserve">STEADY_STATE</w:t>
             </w:r>
@@ -1150,19 +1916,22 @@
               <w:jc w:val="left"/>
             </w:pPr>
             <w:r>
-              <w:t xml:space="preserve">Organic growth only; Emergency Transfer rejected</w:t>
-            </w:r>
-          </w:p>
-        </w:tc>
-        <w:tc>
-          <w:tcPr/>
-          <w:p>
-            <w:pPr>
-              <w:pStyle w:val="Compact"/>
-              <w:jc w:val="left"/>
-            </w:pPr>
-            <w:r>
-              <w:t xml:space="preserve">→ DR_DECLARATION_PENDING</w:t>
+              <w:t xml:space="preserve">Normal inventory, reconciliation, placement, and approved growth.</w:t>
+            </w:r>
+          </w:p>
+        </w:tc>
+        <w:tc>
+          <w:tcPr/>
+          <w:p>
+            <w:pPr>
+              <w:pStyle w:val="Compact"/>
+              <w:jc w:val="left"/>
+            </w:pPr>
+            <w:r>
+              <w:rPr>
+                <w:rStyle w:val="VerbatimChar"/>
+              </w:rPr>
+              <w:t xml:space="preserve">DR_DECLARATION_PENDING</w:t>
             </w:r>
           </w:p>
         </w:tc>
@@ -1177,8 +1946,7 @@
             </w:pPr>
             <w:r>
               <w:rPr>
-                <w:bCs/>
-                <w:b/>
+                <w:rStyle w:val="VerbatimChar"/>
               </w:rPr>
               <w:t xml:space="preserve">DR_DECLARATION_PENDING</w:t>
             </w:r>
@@ -1192,19 +1960,34 @@
               <w:jc w:val="left"/>
             </w:pPr>
             <w:r>
-              <w:t xml:space="preserve">DR requested, awaiting dual approval + validation</w:t>
-            </w:r>
-          </w:p>
-        </w:tc>
-        <w:tc>
-          <w:tcPr/>
-          <w:p>
-            <w:pPr>
-              <w:pStyle w:val="Compact"/>
-              <w:jc w:val="left"/>
-            </w:pPr>
-            <w:r>
-              <w:t xml:space="preserve">→ DR_EVENT_ACTIVE (approved) · → STEADY_STATE (rejected/expired)</w:t>
+              <w:t xml:space="preserve">DR requested and awaiting approval/validation.</w:t>
+            </w:r>
+          </w:p>
+        </w:tc>
+        <w:tc>
+          <w:tcPr/>
+          <w:p>
+            <w:pPr>
+              <w:pStyle w:val="Compact"/>
+              <w:jc w:val="left"/>
+            </w:pPr>
+            <w:r>
+              <w:rPr>
+                <w:rStyle w:val="VerbatimChar"/>
+              </w:rPr>
+              <w:t xml:space="preserve">DR_EVENT_ACTIVE</w:t>
+            </w:r>
+            <w:r>
+              <w:t xml:space="preserve">,</w:t>
+            </w:r>
+            <w:r>
+              <w:t xml:space="preserve"> </w:t>
+            </w:r>
+            <w:r>
+              <w:rPr>
+                <w:rStyle w:val="VerbatimChar"/>
+              </w:rPr>
+              <w:t xml:space="preserve">STEADY_STATE</w:t>
             </w:r>
           </w:p>
         </w:tc>
@@ -1219,8 +2002,7 @@
             </w:pPr>
             <w:r>
               <w:rPr>
-                <w:bCs/>
-                <w:b/>
+                <w:rStyle w:val="VerbatimChar"/>
               </w:rPr>
               <w:t xml:space="preserve">DR_EVENT_ACTIVE</w:t>
             </w:r>
@@ -1234,19 +2016,34 @@
               <w:jc w:val="left"/>
             </w:pPr>
             <w:r>
-              <w:t xml:space="preserve">Crisis operations only; auto-increase suppressed</w:t>
-            </w:r>
-          </w:p>
-        </w:tc>
-        <w:tc>
-          <w:tcPr/>
-          <w:p>
-            <w:pPr>
-              <w:pStyle w:val="Compact"/>
-              <w:jc w:val="left"/>
-            </w:pPr>
-            <w:r>
-              <w:t xml:space="preserve">→ FAILBACK_PENDING · → INCIDENT_HOLD</w:t>
+              <w:t xml:space="preserve">Source-specific DR activation and emergency operations permitted.</w:t>
+            </w:r>
+          </w:p>
+        </w:tc>
+        <w:tc>
+          <w:tcPr/>
+          <w:p>
+            <w:pPr>
+              <w:pStyle w:val="Compact"/>
+              <w:jc w:val="left"/>
+            </w:pPr>
+            <w:r>
+              <w:rPr>
+                <w:rStyle w:val="VerbatimChar"/>
+              </w:rPr>
+              <w:t xml:space="preserve">FAILBACK_PENDING</w:t>
+            </w:r>
+            <w:r>
+              <w:t xml:space="preserve">,</w:t>
+            </w:r>
+            <w:r>
+              <w:t xml:space="preserve"> </w:t>
+            </w:r>
+            <w:r>
+              <w:rPr>
+                <w:rStyle w:val="VerbatimChar"/>
+              </w:rPr>
+              <w:t xml:space="preserve">INCIDENT_HOLD</w:t>
             </w:r>
           </w:p>
         </w:tc>
@@ -1261,8 +2058,7 @@
             </w:pPr>
             <w:r>
               <w:rPr>
-                <w:bCs/>
-                <w:b/>
+                <w:rStyle w:val="VerbatimChar"/>
               </w:rPr>
               <w:t xml:space="preserve">FAILBACK_PENDING</w:t>
             </w:r>
@@ -1276,19 +2072,46 @@
               <w:jc w:val="left"/>
             </w:pPr>
             <w:r>
-              <w:t xml:space="preserve">Failback requested, being validated</w:t>
-            </w:r>
-          </w:p>
-        </w:tc>
-        <w:tc>
-          <w:tcPr/>
-          <w:p>
-            <w:pPr>
-              <w:pStyle w:val="Compact"/>
-              <w:jc w:val="left"/>
-            </w:pPr>
-            <w:r>
-              <w:t xml:space="preserve">→ STEADY_STATE (completed) · → DR_EVENT_ACTIVE (validation failed) · → INCIDENT_HOLD</w:t>
+              <w:t xml:space="preserve">Return/reversal is being validated and executed.</w:t>
+            </w:r>
+          </w:p>
+        </w:tc>
+        <w:tc>
+          <w:tcPr/>
+          <w:p>
+            <w:pPr>
+              <w:pStyle w:val="Compact"/>
+              <w:jc w:val="left"/>
+            </w:pPr>
+            <w:r>
+              <w:rPr>
+                <w:rStyle w:val="VerbatimChar"/>
+              </w:rPr>
+              <w:t xml:space="preserve">STEADY_STATE</w:t>
+            </w:r>
+            <w:r>
+              <w:t xml:space="preserve">,</w:t>
+            </w:r>
+            <w:r>
+              <w:t xml:space="preserve"> </w:t>
+            </w:r>
+            <w:r>
+              <w:rPr>
+                <w:rStyle w:val="VerbatimChar"/>
+              </w:rPr>
+              <w:t xml:space="preserve">DR_EVENT_ACTIVE</w:t>
+            </w:r>
+            <w:r>
+              <w:t xml:space="preserve">,</w:t>
+            </w:r>
+            <w:r>
+              <w:t xml:space="preserve"> </w:t>
+            </w:r>
+            <w:r>
+              <w:rPr>
+                <w:rStyle w:val="VerbatimChar"/>
+              </w:rPr>
+              <w:t xml:space="preserve">INCIDENT_HOLD</w:t>
             </w:r>
           </w:p>
         </w:tc>
@@ -1303,8 +2126,7 @@
             </w:pPr>
             <w:r>
               <w:rPr>
-                <w:bCs/>
-                <w:b/>
+                <w:rStyle w:val="VerbatimChar"/>
               </w:rPr>
               <w:t xml:space="preserve">INCIDENT_HOLD</w:t>
             </w:r>
@@ -1318,19 +2140,19 @@
               <w:jc w:val="left"/>
             </w:pPr>
             <w:r>
-              <w:t xml:space="preserve">State conflict / critical failure — safe hold</w:t>
-            </w:r>
-          </w:p>
-        </w:tc>
-        <w:tc>
-          <w:tcPr/>
-          <w:p>
-            <w:pPr>
-              <w:pStyle w:val="Compact"/>
-              <w:jc w:val="left"/>
-            </w:pPr>
-            <w:r>
-              <w:t xml:space="preserve">→ DR_EVENT_ACTIVE · → FAILBACK_PENDING (on recovery approval)</w:t>
+              <w:t xml:space="preserve">Safe degraded state after conflict or critical failure.</w:t>
+            </w:r>
+          </w:p>
+        </w:tc>
+        <w:tc>
+          <w:tcPr/>
+          <w:p>
+            <w:pPr>
+              <w:pStyle w:val="Compact"/>
+              <w:jc w:val="left"/>
+            </w:pPr>
+            <w:r>
+              <w:t xml:space="preserve">Recovery-approved transition only</w:t>
             </w:r>
           </w:p>
         </w:tc>
@@ -1341,107 +2163,41 @@
         <w:pStyle w:val="BodyText"/>
       </w:pPr>
       <w:r>
-        <w:t xml:space="preserve">All transitions are</w:t>
-      </w:r>
-      <w:r>
-        <w:t xml:space="preserve"> </w:t>
-      </w:r>
-      <w:r>
-        <w:rPr>
-          <w:bCs/>
-          <w:b/>
-        </w:rPr>
-        <w:t xml:space="preserve">operator-gated with dual approval</w:t>
-      </w:r>
-      <w:r>
-        <w:t xml:space="preserve"> </w:t>
-      </w:r>
-      <w:r>
-        <w:t xml:space="preserve">— never automatic.</w:t>
-      </w:r>
-    </w:p>
-    <w:p>
-      <w:pPr>
-        <w:pStyle w:val="CaptionedFigure"/>
-      </w:pPr>
-      <w:r>
-        <w:drawing>
-          <wp:inline>
-            <wp:extent cx="5334000" cy="3918857"/>
-            <wp:effectExtent b="0" l="0" r="0" t="0"/>
-            <wp:docPr descr="Figure 2. Five-state engine mode machine — every transition is operator-gated with dual approval." title="" id="25" name="Picture"/>
-            <a:graphic>
-              <a:graphicData uri="http://schemas.openxmlformats.org/drawingml/2006/picture">
-                <pic:pic>
-                  <pic:nvPicPr>
-                    <pic:cNvPr descr="diagrams/adr003_state_machine.png" id="26" name="Picture"/>
-                    <pic:cNvPicPr>
-                      <a:picLocks noChangeArrowheads="1" noChangeAspect="1"/>
-                    </pic:cNvPicPr>
-                  </pic:nvPicPr>
-                  <pic:blipFill>
-                    <a:blip r:embed="rId24"/>
-                    <a:stretch>
-                      <a:fillRect/>
-                    </a:stretch>
-                  </pic:blipFill>
-                  <pic:spPr bwMode="auto">
-                    <a:xfrm>
-                      <a:off x="0" y="0"/>
-                      <a:ext cx="5334000" cy="3918857"/>
-                    </a:xfrm>
-                    <a:prstGeom prst="rect">
-                      <a:avLst/>
-                    </a:prstGeom>
-                    <a:noFill/>
-                    <a:ln w="9525">
-                      <a:noFill/>
-                      <a:headEnd/>
-                      <a:tailEnd/>
-                    </a:ln>
-                  </pic:spPr>
-                </pic:pic>
-              </a:graphicData>
-            </a:graphic>
-          </wp:inline>
-        </w:drawing>
-      </w:r>
-    </w:p>
-    <w:p>
-      <w:pPr>
-        <w:pStyle w:val="ImageCaption"/>
-      </w:pPr>
-      <w:r>
-        <w:rPr>
-          <w:bCs/>
-          <w:b/>
-        </w:rPr>
-        <w:t xml:space="preserve">Figure 2.</w:t>
-      </w:r>
-      <w:r>
-        <w:t xml:space="preserve"> </w:t>
-      </w:r>
-      <w:r>
-        <w:t xml:space="preserve">Five-state engine mode machine — every transition is operator-gated with dual approval.</w:t>
-      </w:r>
-    </w:p>
-    <w:bookmarkEnd w:id="27"/>
-    <w:bookmarkStart w:id="28" w:name="enginemodestate-entity"/>
-    <w:p>
-      <w:pPr>
-        <w:pStyle w:val="Heading4"/>
-      </w:pPr>
-      <w:r>
-        <w:rPr>
-          <w:rStyle w:val="VerbatimChar"/>
-        </w:rPr>
-        <w:t xml:space="preserve">EngineModeState</w:t>
-      </w:r>
-      <w:r>
-        <w:t xml:space="preserve"> </w:t>
-      </w:r>
-      <w:r>
-        <w:t xml:space="preserve">Entity</w:t>
+        <w:t xml:space="preserve">Entering</w:t>
+      </w:r>
+      <w:r>
+        <w:t xml:space="preserve"> </w:t>
+      </w:r>
+      <w:r>
+        <w:rPr>
+          <w:rStyle w:val="VerbatimChar"/>
+        </w:rPr>
+        <w:t xml:space="preserve">DR_EVENT_ACTIVE</w:t>
+      </w:r>
+      <w:r>
+        <w:t xml:space="preserve"> </w:t>
+      </w:r>
+      <w:r>
+        <w:t xml:space="preserve">does not automatically authorise service-impacting CVAL action, Tier 2, or Tier 3. Each action still requires its own policy gate.</w:t>
+      </w:r>
+      <w:r>
+        <w:t xml:space="preserve"> </w:t>
+      </w:r>
+      <w:r>
+        <w:rPr>
+          <w:rStyle w:val="VerbatimChar"/>
+        </w:rPr>
+        <w:t xml:space="preserve">[Decided]</w:t>
+      </w:r>
+    </w:p>
+    <w:bookmarkEnd w:id="26"/>
+    <w:bookmarkStart w:id="27" w:name="relationship-to-emergency-tiers"/>
+    <w:p>
+      <w:pPr>
+        <w:pStyle w:val="Heading2"/>
+      </w:pPr>
+      <w:r>
+        <w:t xml:space="preserve">Relationship to Emergency Tiers</w:t>
       </w:r>
     </w:p>
     <w:p>
@@ -1449,281 +2205,7 @@
         <w:pStyle w:val="FirstParagraph"/>
       </w:pPr>
       <w:r>
-        <w:t xml:space="preserve">Must carry: environment/control-plane scope · current mode · state version · incident ID · requested-by · approved-by · transition timestamp · transition reason · active operation IDs · lease owner + expiry · recovery checkpoint.</w:t>
-      </w:r>
-      <w:r>
-        <w:t xml:space="preserve"> </w:t>
-      </w:r>
-      <w:r>
-        <w:rPr>
-          <w:rStyle w:val="VerbatimChar"/>
-        </w:rPr>
-        <w:t xml:space="preserve">[Documented]</w:t>
-      </w:r>
-    </w:p>
-    <w:bookmarkEnd w:id="28"/>
-    <w:bookmarkStart w:id="29" w:name="dr-activation-semantics"/>
-    <w:p>
-      <w:pPr>
-        <w:pStyle w:val="Heading4"/>
-      </w:pPr>
-      <w:r>
-        <w:t xml:space="preserve">DR Activation Semantics</w:t>
-      </w:r>
-    </w:p>
-    <w:p>
-      <w:pPr>
-        <w:pStyle w:val="FirstParagraph"/>
-      </w:pPr>
-      <w:r>
-        <w:t xml:space="preserve">Entering</w:t>
-      </w:r>
-      <w:r>
-        <w:t xml:space="preserve"> </w:t>
-      </w:r>
-      <w:r>
-        <w:rPr>
-          <w:rStyle w:val="VerbatimChar"/>
-        </w:rPr>
-        <w:t xml:space="preserve">DR_EVENT_ACTIVE</w:t>
-      </w:r>
-      <w:r>
-        <w:t xml:space="preserve"> </w:t>
-      </w:r>
-      <w:r>
-        <w:rPr>
-          <w:bCs/>
-          <w:b/>
-        </w:rPr>
-        <w:t xml:space="preserve">only establishes the operating mode</w:t>
-      </w:r>
-      <w:r>
-        <w:t xml:space="preserve"> </w:t>
-      </w:r>
-      <w:r>
-        <w:t xml:space="preserve">in which separately-governed emergency operations may be evaluated — it does</w:t>
-      </w:r>
-      <w:r>
-        <w:t xml:space="preserve"> </w:t>
-      </w:r>
-      <w:r>
-        <w:rPr>
-          <w:bCs/>
-          <w:b/>
-        </w:rPr>
-        <w:t xml:space="preserve">not</w:t>
-      </w:r>
-      <w:r>
-        <w:t xml:space="preserve"> </w:t>
-      </w:r>
-      <w:r>
-        <w:t xml:space="preserve">automatically authorize Tier 2 or Tier 3. Each tier is independently gated. The DR orchestrator validates group and subscription quota and CR/sharing state before starting any approved failover deployment, and records active-or-incident-hold state back to the state service.</w:t>
-      </w:r>
-      <w:r>
-        <w:t xml:space="preserve"> </w:t>
-      </w:r>
-      <w:r>
-        <w:rPr>
-          <w:rStyle w:val="VerbatimChar"/>
-        </w:rPr>
-        <w:t xml:space="preserve">[Documented]</w:t>
-      </w:r>
-    </w:p>
-    <w:bookmarkEnd w:id="29"/>
-    <w:bookmarkEnd w:id="30"/>
-    <w:bookmarkStart w:id="31" w:name="consequences"/>
-    <w:p>
-      <w:pPr>
-        <w:pStyle w:val="Heading3"/>
-      </w:pPr>
-      <w:r>
-        <w:t xml:space="preserve">Consequences</w:t>
-      </w:r>
-    </w:p>
-    <w:p>
-      <w:pPr>
-        <w:pStyle w:val="FirstParagraph"/>
-      </w:pPr>
-      <w:r>
-        <w:rPr>
-          <w:bCs/>
-          <w:b/>
-        </w:rPr>
-        <w:t xml:space="preserve">Positive:</w:t>
-      </w:r>
-      <w:r>
-        <w:t xml:space="preserve"> </w:t>
-      </w:r>
-      <w:r>
-        <w:t xml:space="preserve">- Idle NonProd capacity doubles as DR overflow, cutting the cost of pre-positioned DR reserve while HC-6 guarantees sufficiency.</w:t>
-      </w:r>
-      <w:r>
-        <w:t xml:space="preserve"> </w:t>
-      </w:r>
-      <w:r>
-        <w:t xml:space="preserve">- The</w:t>
-      </w:r>
-      <w:r>
-        <w:t xml:space="preserve"> </w:t>
-      </w:r>
-      <w:r>
-        <w:rPr>
-          <w:rStyle w:val="VerbatimChar"/>
-        </w:rPr>
-        <w:t xml:space="preserve">engine_mode</w:t>
-      </w:r>
-      <w:r>
-        <w:t xml:space="preserve"> </w:t>
-      </w:r>
-      <w:r>
-        <w:t xml:space="preserve">gate makes it structurally impossible for routine reconciliation to trigger destructive VM operations.</w:t>
-      </w:r>
-      <w:r>
-        <w:t xml:space="preserve"> </w:t>
-      </w:r>
-      <w:r>
-        <w:t xml:space="preserve">- Tier 2 delivers meaningful crisis capacity</w:t>
-      </w:r>
-      <w:r>
-        <w:t xml:space="preserve"> </w:t>
-      </w:r>
-      <w:r>
-        <w:rPr>
-          <w:bCs/>
-          <w:b/>
-        </w:rPr>
-        <w:t xml:space="preserve">with zero VM disruption and zero Azure quota wait</w:t>
-      </w:r>
-      <w:r>
-        <w:t xml:space="preserve"> </w:t>
-      </w:r>
-      <w:r>
-        <w:t xml:space="preserve">— the common escalation path avoids Tier 3 entirely.</w:t>
-      </w:r>
-      <w:r>
-        <w:t xml:space="preserve"> </w:t>
-      </w:r>
-      <w:r>
-        <w:t xml:space="preserve">- Every operation is tagged with its operating mode for a clean audit trail.</w:t>
-      </w:r>
-    </w:p>
-    <w:p>
-      <w:pPr>
-        <w:pStyle w:val="BodyText"/>
-      </w:pPr>
-      <w:r>
-        <w:rPr>
-          <w:bCs/>
-          <w:b/>
-        </w:rPr>
-        <w:t xml:space="preserve">Negative / trade-offs:</w:t>
-      </w:r>
-      <w:r>
-        <w:t xml:space="preserve"> </w:t>
-      </w:r>
-      <w:r>
-        <w:t xml:space="preserve">- Co-location adds risk that NonProd over-consumption erodes DR overflow; mitigated by HC-6,</w:t>
-      </w:r>
-      <w:r>
-        <w:t xml:space="preserve"> </w:t>
-      </w:r>
-      <w:r>
-        <w:rPr>
-          <w:rStyle w:val="VerbatimChar"/>
-        </w:rPr>
-        <w:t xml:space="preserve">dr_overflow_reserve</w:t>
-      </w:r>
-      <w:r>
-        <w:t xml:space="preserve">, and floor alerting.</w:t>
-      </w:r>
-      <w:r>
-        <w:t xml:space="preserve"> </w:t>
-      </w:r>
-      <w:r>
-        <w:t xml:space="preserve">-</w:t>
-      </w:r>
-      <w:r>
-        <w:t xml:space="preserve"> </w:t>
-      </w:r>
-      <w:r>
-        <w:rPr>
-          <w:rStyle w:val="VerbatimChar"/>
-        </w:rPr>
-        <w:t xml:space="preserve">engine_mode</w:t>
-      </w:r>
-      <w:r>
-        <w:t xml:space="preserve"> </w:t>
-      </w:r>
-      <w:r>
-        <w:t xml:space="preserve">must be a formal Cosmos DB state propagated to every reconciliation cycle, with operator-gated, dual-approval transitions.</w:t>
-      </w:r>
-      <w:r>
-        <w:t xml:space="preserve"> </w:t>
-      </w:r>
-      <w:r>
-        <w:t xml:space="preserve">-</w:t>
-      </w:r>
-      <w:r>
-        <w:t xml:space="preserve"> </w:t>
-      </w:r>
-      <w:r>
-        <w:rPr>
-          <w:bCs/>
-          <w:b/>
-        </w:rPr>
-        <w:t xml:space="preserve">Tier 3 is blocked</w:t>
-      </w:r>
-      <w:r>
-        <w:t xml:space="preserve"> </w:t>
-      </w:r>
-      <w:r>
-        <w:t xml:space="preserve">until the consumer-credential model (Managed Identity vs cross-tenant service-principal) and the engine-mode state machine are resolved — a known Phase-1 limitation.</w:t>
-      </w:r>
-      <w:r>
-        <w:t xml:space="preserve"> </w:t>
-      </w:r>
-      <w:r>
-        <w:t xml:space="preserve">- Tier 3 requires a rare, audited break-glass role (</w:t>
-      </w:r>
-      <w:r>
-        <w:rPr>
-          <w:rStyle w:val="VerbatimChar"/>
-        </w:rPr>
-        <w:t xml:space="preserve">ACRME.SuperAdmin</w:t>
-      </w:r>
-      <w:r>
-        <w:t xml:space="preserve">) for single-approver override.</w:t>
-      </w:r>
-      <w:r>
-        <w:t xml:space="preserve"> </w:t>
-      </w:r>
-      <w:r>
-        <w:t xml:space="preserve">- Requires per-CRG-type</w:t>
-      </w:r>
-      <w:r>
-        <w:t xml:space="preserve"> </w:t>
-      </w:r>
-      <w:r>
-        <w:rPr>
-          <w:rStyle w:val="VerbatimChar"/>
-        </w:rPr>
-        <w:t xml:space="preserve">RegionalSnapshot</w:t>
-      </w:r>
-      <w:r>
-        <w:t xml:space="preserve"> </w:t>
-      </w:r>
-      <w:r>
-        <w:t xml:space="preserve">fields to evaluate HC-6.</w:t>
-      </w:r>
-    </w:p>
-    <w:bookmarkEnd w:id="31"/>
-    <w:bookmarkStart w:id="32" w:name="alternatives-considered"/>
-    <w:p>
-      <w:pPr>
-        <w:pStyle w:val="Heading3"/>
-      </w:pPr>
-      <w:r>
-        <w:t xml:space="preserve">Alternatives Considered</w:t>
+        <w:t xml:space="preserve">The previous three-tier emergency transfer model remains as an implementation pattern, but v2.1 scopes it behind bootstrap-first activation:</w:t>
       </w:r>
     </w:p>
     <w:tbl>
@@ -1748,19 +2230,19 @@
               <w:jc w:val="left"/>
             </w:pPr>
             <w:r>
-              <w:t xml:space="preserve">Alternative</w:t>
-            </w:r>
-          </w:p>
-        </w:tc>
-        <w:tc>
-          <w:tcPr/>
-          <w:p>
-            <w:pPr>
-              <w:pStyle w:val="Compact"/>
-              <w:jc w:val="left"/>
-            </w:pPr>
-            <w:r>
-              <w:t xml:space="preserve">Why Rejected</w:t>
+              <w:t xml:space="preserve">Tier</w:t>
+            </w:r>
+          </w:p>
+        </w:tc>
+        <w:tc>
+          <w:tcPr/>
+          <w:p>
+            <w:pPr>
+              <w:pStyle w:val="Compact"/>
+              <w:jc w:val="left"/>
+            </w:pPr>
+            <w:r>
+              <w:t xml:space="preserve">v2.1 treatment</w:t>
             </w:r>
           </w:p>
         </w:tc>
@@ -1774,23 +2256,489 @@
               <w:jc w:val="left"/>
             </w:pPr>
             <w:r>
-              <w:rPr>
-                <w:bCs/>
-                <w:b/>
-              </w:rPr>
-              <w:t xml:space="preserve">Keep DR_region ≠ NonProd_region</w:t>
-            </w:r>
-          </w:p>
-        </w:tc>
-        <w:tc>
-          <w:tcPr/>
-          <w:p>
-            <w:pPr>
-              <w:pStyle w:val="Compact"/>
-              <w:jc w:val="left"/>
-            </w:pPr>
-            <w:r>
-              <w:t xml:space="preserve">Prevents using NonProd as DR overflow — the whole point of co-location.</w:t>
+              <w:t xml:space="preserve">Tier 1 - direct expansion</w:t>
+            </w:r>
+          </w:p>
+        </w:tc>
+        <w:tc>
+          <w:tcPr/>
+          <w:p>
+            <w:pPr>
+              <w:pStyle w:val="Compact"/>
+              <w:jc w:val="left"/>
+            </w:pPr>
+            <w:r>
+              <w:t xml:space="preserve">Permitted after DR declaration when quota/capacity/sharing preconditions are fresh.</w:t>
+            </w:r>
+          </w:p>
+        </w:tc>
+      </w:tr>
+      <w:tr>
+        <w:tc>
+          <w:tcPr/>
+          <w:p>
+            <w:pPr>
+              <w:pStyle w:val="Compact"/>
+              <w:jc w:val="left"/>
+            </w:pPr>
+            <w:r>
+              <w:t xml:space="preserve">Tier 2 - quota-neutral transfer</w:t>
+            </w:r>
+          </w:p>
+        </w:tc>
+        <w:tc>
+          <w:tcPr/>
+          <w:p>
+            <w:pPr>
+              <w:pStyle w:val="Compact"/>
+              <w:jc w:val="left"/>
+            </w:pPr>
+            <w:r>
+              <w:t xml:space="preserve">Approval-gated until quota group release and consumer quota behavior are proven.</w:t>
+            </w:r>
+          </w:p>
+        </w:tc>
+      </w:tr>
+      <w:tr>
+        <w:tc>
+          <w:tcPr/>
+          <w:p>
+            <w:pPr>
+              <w:pStyle w:val="Compact"/>
+              <w:jc w:val="left"/>
+            </w:pPr>
+            <w:r>
+              <w:t xml:space="preserve">Tier 3 - destructive VM association changes</w:t>
+            </w:r>
+          </w:p>
+        </w:tc>
+        <w:tc>
+          <w:tcPr/>
+          <w:p>
+            <w:pPr>
+              <w:pStyle w:val="Compact"/>
+              <w:jc w:val="left"/>
+            </w:pPr>
+            <w:r>
+              <w:t xml:space="preserve">Blocked in Phase 1; VMSS entries are rejected.</w:t>
+            </w:r>
+          </w:p>
+        </w:tc>
+      </w:tr>
+    </w:tbl>
+    <w:bookmarkEnd w:id="27"/>
+    <w:bookmarkStart w:id="28" w:name="observability-and-runbooks"/>
+    <w:p>
+      <w:pPr>
+        <w:pStyle w:val="Heading2"/>
+      </w:pPr>
+      <w:r>
+        <w:t xml:space="preserve">Observability and Runbooks</w:t>
+      </w:r>
+    </w:p>
+    <w:p>
+      <w:pPr>
+        <w:pStyle w:val="FirstParagraph"/>
+      </w:pPr>
+      <w:r>
+        <w:t xml:space="preserve">ACRME dashboards and alerts must show:</w:t>
+      </w:r>
+    </w:p>
+    <w:p>
+      <w:pPr>
+        <w:numPr>
+          <w:ilvl w:val="0"/>
+          <w:numId w:val="1005"/>
+        </w:numPr>
+        <w:pStyle w:val="Compact"/>
+      </w:pPr>
+      <w:r>
+        <w:t xml:space="preserve">DR bootstrap below target;</w:t>
+      </w:r>
+    </w:p>
+    <w:p>
+      <w:pPr>
+        <w:numPr>
+          <w:ilvl w:val="0"/>
+          <w:numId w:val="1005"/>
+        </w:numPr>
+        <w:pStyle w:val="Compact"/>
+      </w:pPr>
+      <w:r>
+        <w:t xml:space="preserve">destination coverage below max protected source;</w:t>
+      </w:r>
+    </w:p>
+    <w:p>
+      <w:pPr>
+        <w:numPr>
+          <w:ilvl w:val="0"/>
+          <w:numId w:val="1005"/>
+        </w:numPr>
+        <w:pStyle w:val="Compact"/>
+      </w:pPr>
+      <w:r>
+        <w:t xml:space="preserve">source &lt;-&gt; destination mapping;</w:t>
+      </w:r>
+    </w:p>
+    <w:p>
+      <w:pPr>
+        <w:numPr>
+          <w:ilvl w:val="0"/>
+          <w:numId w:val="1005"/>
+        </w:numPr>
+        <w:pStyle w:val="Compact"/>
+      </w:pPr>
+      <w:r>
+        <w:t xml:space="preserve">activation state by customer and priority wave;</w:t>
+      </w:r>
+    </w:p>
+    <w:p>
+      <w:pPr>
+        <w:numPr>
+          <w:ilvl w:val="0"/>
+          <w:numId w:val="1005"/>
+        </w:numPr>
+        <w:pStyle w:val="Compact"/>
+      </w:pPr>
+      <w:r>
+        <w:t xml:space="preserve">CVAL earmarks and releasable capacity;</w:t>
+      </w:r>
+    </w:p>
+    <w:p>
+      <w:pPr>
+        <w:numPr>
+          <w:ilvl w:val="0"/>
+          <w:numId w:val="1005"/>
+        </w:numPr>
+        <w:pStyle w:val="Compact"/>
+      </w:pPr>
+      <w:r>
+        <w:t xml:space="preserve">quota/capacity deficits after each acquisition stage;</w:t>
+      </w:r>
+    </w:p>
+    <w:p>
+      <w:pPr>
+        <w:numPr>
+          <w:ilvl w:val="0"/>
+          <w:numId w:val="1005"/>
+        </w:numPr>
+        <w:pStyle w:val="Compact"/>
+      </w:pPr>
+      <w:r>
+        <w:t xml:space="preserve">failed/stale activation state;</w:t>
+      </w:r>
+    </w:p>
+    <w:p>
+      <w:pPr>
+        <w:numPr>
+          <w:ilvl w:val="0"/>
+          <w:numId w:val="1005"/>
+        </w:numPr>
+        <w:pStyle w:val="Compact"/>
+      </w:pPr>
+      <w:r>
+        <w:t xml:space="preserve">failback pending age.</w:t>
+      </w:r>
+      <w:r>
+        <w:t xml:space="preserve"> </w:t>
+      </w:r>
+      <w:r>
+        <w:rPr>
+          <w:rStyle w:val="VerbatimChar"/>
+        </w:rPr>
+        <w:t xml:space="preserve">[Decided]</w:t>
+      </w:r>
+    </w:p>
+    <w:p>
+      <w:pPr>
+        <w:pStyle w:val="FirstParagraph"/>
+      </w:pPr>
+      <w:r>
+        <w:t xml:space="preserve">Runbooks must cover DR declaration, standby activation, CVAL release/shutdown/disassociation, quota allocation to DR, sharing activation, manual emergency override, regional recovery, and failback.</w:t>
+      </w:r>
+      <w:r>
+        <w:t xml:space="preserve"> </w:t>
+      </w:r>
+      <w:r>
+        <w:rPr>
+          <w:rStyle w:val="VerbatimChar"/>
+        </w:rPr>
+        <w:t xml:space="preserve">[Decided]</w:t>
+      </w:r>
+    </w:p>
+    <w:bookmarkEnd w:id="28"/>
+    <w:bookmarkStart w:id="29" w:name="consequences"/>
+    <w:p>
+      <w:pPr>
+        <w:pStyle w:val="Heading2"/>
+      </w:pPr>
+      <w:r>
+        <w:t xml:space="preserve">Consequences</w:t>
+      </w:r>
+    </w:p>
+    <w:p>
+      <w:pPr>
+        <w:pStyle w:val="FirstParagraph"/>
+      </w:pPr>
+      <w:r>
+        <w:rPr>
+          <w:bCs/>
+          <w:b/>
+        </w:rPr>
+        <w:t xml:space="preserve">Positive</w:t>
+      </w:r>
+    </w:p>
+    <w:p>
+      <w:pPr>
+        <w:numPr>
+          <w:ilvl w:val="0"/>
+          <w:numId w:val="1006"/>
+        </w:numPr>
+        <w:pStyle w:val="Compact"/>
+      </w:pPr>
+      <w:r>
+        <w:t xml:space="preserve">Removes the high-cost fixed 30-40% standby reserve as the default.</w:t>
+      </w:r>
+      <w:r>
+        <w:t xml:space="preserve"> </w:t>
+      </w:r>
+      <w:r>
+        <w:rPr>
+          <w:rStyle w:val="VerbatimChar"/>
+        </w:rPr>
+        <w:t xml:space="preserve">[Decided]</w:t>
+      </w:r>
+    </w:p>
+    <w:p>
+      <w:pPr>
+        <w:numPr>
+          <w:ilvl w:val="0"/>
+          <w:numId w:val="1006"/>
+        </w:numPr>
+        <w:pStyle w:val="Compact"/>
+      </w:pPr>
+      <w:r>
+        <w:t xml:space="preserve">Aligns standby sizing with the single-region-failure assumption.</w:t>
+      </w:r>
+      <w:r>
+        <w:t xml:space="preserve"> </w:t>
+      </w:r>
+      <w:r>
+        <w:rPr>
+          <w:rStyle w:val="VerbatimChar"/>
+        </w:rPr>
+        <w:t xml:space="preserve">[Derived]</w:t>
+      </w:r>
+    </w:p>
+    <w:p>
+      <w:pPr>
+        <w:numPr>
+          <w:ilvl w:val="0"/>
+          <w:numId w:val="1006"/>
+        </w:numPr>
+        <w:pStyle w:val="Compact"/>
+      </w:pPr>
+      <w:r>
+        <w:t xml:space="preserve">Supports reciprocal multi-source hosting without summing unrelated non-concurrent sources.</w:t>
+      </w:r>
+      <w:r>
+        <w:t xml:space="preserve"> </w:t>
+      </w:r>
+      <w:r>
+        <w:rPr>
+          <w:rStyle w:val="VerbatimChar"/>
+        </w:rPr>
+        <w:t xml:space="preserve">[Decided]</w:t>
+      </w:r>
+    </w:p>
+    <w:p>
+      <w:pPr>
+        <w:numPr>
+          <w:ilvl w:val="0"/>
+          <w:numId w:val="1006"/>
+        </w:numPr>
+        <w:pStyle w:val="Compact"/>
+      </w:pPr>
+      <w:r>
+        <w:t xml:space="preserve">Makes activation deterministic from the DR index and seed records.</w:t>
+      </w:r>
+      <w:r>
+        <w:t xml:space="preserve"> </w:t>
+      </w:r>
+      <w:r>
+        <w:rPr>
+          <w:rStyle w:val="VerbatimChar"/>
+        </w:rPr>
+        <w:t xml:space="preserve">[Decided]</w:t>
+      </w:r>
+    </w:p>
+    <w:p>
+      <w:pPr>
+        <w:pStyle w:val="FirstParagraph"/>
+      </w:pPr>
+      <w:r>
+        <w:rPr>
+          <w:bCs/>
+          <w:b/>
+        </w:rPr>
+        <w:t xml:space="preserve">Negative / trade-offs</w:t>
+      </w:r>
+    </w:p>
+    <w:p>
+      <w:pPr>
+        <w:numPr>
+          <w:ilvl w:val="0"/>
+          <w:numId w:val="1007"/>
+        </w:numPr>
+        <w:pStyle w:val="Compact"/>
+      </w:pPr>
+      <w:r>
+        <w:t xml:space="preserve">Max-not-sum under-protects two simultaneous source-region failures unless SUM override is configured.</w:t>
+      </w:r>
+      <w:r>
+        <w:t xml:space="preserve"> </w:t>
+      </w:r>
+      <w:r>
+        <w:rPr>
+          <w:rStyle w:val="VerbatimChar"/>
+        </w:rPr>
+        <w:t xml:space="preserve">[Derived]</w:t>
+      </w:r>
+    </w:p>
+    <w:p>
+      <w:pPr>
+        <w:numPr>
+          <w:ilvl w:val="0"/>
+          <w:numId w:val="1007"/>
+        </w:numPr>
+        <w:pStyle w:val="Compact"/>
+      </w:pPr>
+      <w:r>
+        <w:t xml:space="preserve">Capacity Reservation Sharing remains a preview/feature-maturity dependency for parts of the cost model.</w:t>
+      </w:r>
+      <w:r>
+        <w:t xml:space="preserve"> </w:t>
+      </w:r>
+      <w:r>
+        <w:rPr>
+          <w:rStyle w:val="VerbatimChar"/>
+        </w:rPr>
+        <w:t xml:space="preserve">[Assumed]</w:t>
+      </w:r>
+    </w:p>
+    <w:p>
+      <w:pPr>
+        <w:numPr>
+          <w:ilvl w:val="0"/>
+          <w:numId w:val="1007"/>
+        </w:numPr>
+        <w:pStyle w:val="Compact"/>
+      </w:pPr>
+      <w:r>
+        <w:t xml:space="preserve">Bootstrap sizing requires workload-specific POC evidence.</w:t>
+      </w:r>
+      <w:r>
+        <w:t xml:space="preserve"> </w:t>
+      </w:r>
+      <w:r>
+        <w:rPr>
+          <w:rStyle w:val="VerbatimChar"/>
+        </w:rPr>
+        <w:t xml:space="preserve">[Assumed]</w:t>
+      </w:r>
+    </w:p>
+    <w:p>
+      <w:pPr>
+        <w:numPr>
+          <w:ilvl w:val="0"/>
+          <w:numId w:val="1007"/>
+        </w:numPr>
+        <w:pStyle w:val="Compact"/>
+      </w:pPr>
+      <w:r>
+        <w:t xml:space="preserve">CVAL release can be service-impacting and therefore requires explicit authorisation.</w:t>
+      </w:r>
+      <w:r>
+        <w:t xml:space="preserve"> </w:t>
+      </w:r>
+      <w:r>
+        <w:rPr>
+          <w:rStyle w:val="VerbatimChar"/>
+        </w:rPr>
+        <w:t xml:space="preserve">[Decided]</w:t>
+      </w:r>
+    </w:p>
+    <w:bookmarkEnd w:id="29"/>
+    <w:bookmarkStart w:id="30" w:name="alternatives-considered"/>
+    <w:p>
+      <w:pPr>
+        <w:pStyle w:val="Heading2"/>
+      </w:pPr>
+      <w:r>
+        <w:t xml:space="preserve">Alternatives Considered</w:t>
+      </w:r>
+    </w:p>
+    <w:tbl>
+      <w:tblPr>
+        <w:tblStyle w:val="Table"/>
+        <w:tblW w:type="pct" w:w="5000"/>
+        <w:tblLook w:firstRow="1" w:lastRow="0" w:firstColumn="0" w:lastColumn="0" w:noHBand="0" w:noVBand="0" w:val="0020"/>
+      </w:tblPr>
+      <w:tblGrid>
+        <w:gridCol w:w="3960"/>
+        <w:gridCol w:w="3960"/>
+      </w:tblGrid>
+      <w:tr>
+        <w:trPr>
+          <w:tblHeader w:val="true"/>
+        </w:trPr>
+        <w:tc>
+          <w:tcPr/>
+          <w:p>
+            <w:pPr>
+              <w:pStyle w:val="Compact"/>
+              <w:jc w:val="left"/>
+            </w:pPr>
+            <w:r>
+              <w:t xml:space="preserve">Alternative</w:t>
+            </w:r>
+          </w:p>
+        </w:tc>
+        <w:tc>
+          <w:tcPr/>
+          <w:p>
+            <w:pPr>
+              <w:pStyle w:val="Compact"/>
+              <w:jc w:val="left"/>
+            </w:pPr>
+            <w:r>
+              <w:t xml:space="preserve">Disposition</w:t>
+            </w:r>
+          </w:p>
+        </w:tc>
+      </w:tr>
+      <w:tr>
+        <w:tc>
+          <w:tcPr/>
+          <w:p>
+            <w:pPr>
+              <w:pStyle w:val="Compact"/>
+              <w:jc w:val="left"/>
+            </w:pPr>
+            <w:r>
+              <w:t xml:space="preserve">Fixed 30-40% production copy</w:t>
+            </w:r>
+          </w:p>
+        </w:tc>
+        <w:tc>
+          <w:tcPr/>
+          <w:p>
+            <w:pPr>
+              <w:pStyle w:val="Compact"/>
+              <w:jc w:val="left"/>
+            </w:pPr>
+            <w:r>
+              <w:t xml:space="preserve">Rejected as default because of idle cost and v2.1 pivot.</w:t>
             </w:r>
             <w:r>
               <w:t xml:space="preserve"> </w:t>
@@ -1813,23 +2761,19 @@
               <w:jc w:val="left"/>
             </w:pPr>
             <w:r>
-              <w:rPr>
-                <w:bCs/>
-                <w:b/>
-              </w:rPr>
-              <w:t xml:space="preserve">Remove separation with no compensating HC</w:t>
-            </w:r>
-          </w:p>
-        </w:tc>
-        <w:tc>
-          <w:tcPr/>
-          <w:p>
-            <w:pPr>
-              <w:pStyle w:val="Compact"/>
-              <w:jc w:val="left"/>
-            </w:pPr>
-            <w:r>
-              <w:t xml:space="preserve">Risks NonProd over-consumption leaving no DR headroom.</w:t>
+              <w:t xml:space="preserve">Sum all sources per destination</w:t>
+            </w:r>
+          </w:p>
+        </w:tc>
+        <w:tc>
+          <w:tcPr/>
+          <w:p>
+            <w:pPr>
+              <w:pStyle w:val="Compact"/>
+              <w:jc w:val="left"/>
+            </w:pPr>
+            <w:r>
+              <w:t xml:space="preserve">Rejected as default; too expensive under single-region-failure assumption.</w:t>
             </w:r>
             <w:r>
               <w:t xml:space="preserve"> </w:t>
@@ -1852,23 +2796,19 @@
               <w:jc w:val="left"/>
             </w:pPr>
             <w:r>
-              <w:rPr>
-                <w:bCs/>
-                <w:b/>
-              </w:rPr>
-              <w:t xml:space="preserve">Unified capacity engine with mode flags</w:t>
-            </w:r>
-          </w:p>
-        </w:tc>
-        <w:tc>
-          <w:tcPr/>
-          <w:p>
-            <w:pPr>
-              <w:pStyle w:val="Compact"/>
-              <w:jc w:val="left"/>
-            </w:pPr>
-            <w:r>
-              <w:t xml:space="preserve">Mode flags create complex conditionals and risk triggering VM disassociation during routine reconciliation.</w:t>
+              <w:t xml:space="preserve">Zero DR bootstrap by default</w:t>
+            </w:r>
+          </w:p>
+        </w:tc>
+        <w:tc>
+          <w:tcPr/>
+          <w:p>
+            <w:pPr>
+              <w:pStyle w:val="Compact"/>
+              <w:jc w:val="left"/>
+            </w:pPr>
+            <w:r>
+              <w:t xml:space="preserve">Rejected; zero is allowed only by explicit approved policy.</w:t>
             </w:r>
             <w:r>
               <w:t xml:space="preserve"> </w:t>
@@ -1891,23 +2831,19 @@
               <w:jc w:val="left"/>
             </w:pPr>
             <w:r>
-              <w:rPr>
-                <w:bCs/>
-                <w:b/>
-              </w:rPr>
-              <w:t xml:space="preserve">Emergency transfer as an extension of auto-increase</w:t>
-            </w:r>
-          </w:p>
-        </w:tc>
-        <w:tc>
-          <w:tcPr/>
-          <w:p>
-            <w:pPr>
-              <w:pStyle w:val="Compact"/>
-              <w:jc w:val="left"/>
-            </w:pPr>
-            <w:r>
-              <w:t xml:space="preserve">Conflates policy-driven growth with operator-gated crisis response; could run destructive ops without a DR declaration.</w:t>
+              <w:t xml:space="preserve">Treat CVAL free capacity as always available</w:t>
+            </w:r>
+          </w:p>
+        </w:tc>
+        <w:tc>
+          <w:tcPr/>
+          <w:p>
+            <w:pPr>
+              <w:pStyle w:val="Compact"/>
+              <w:jc w:val="left"/>
+            </w:pPr>
+            <w:r>
+              <w:t xml:space="preserve">Rejected; requires earmark, authorisation, and no-double-count controls.</w:t>
             </w:r>
             <w:r>
               <w:t xml:space="preserve"> </w:t>
@@ -1930,23 +2866,19 @@
               <w:jc w:val="left"/>
             </w:pPr>
             <w:r>
-              <w:rPr>
-                <w:bCs/>
-                <w:b/>
-              </w:rPr>
-              <w:t xml:space="preserve">Two tiers only (automated + destructive)</w:t>
-            </w:r>
-          </w:p>
-        </w:tc>
-        <w:tc>
-          <w:tcPr/>
-          <w:p>
-            <w:pPr>
-              <w:pStyle w:val="Compact"/>
-              <w:jc w:val="left"/>
-            </w:pPr>
-            <w:r>
-              <w:t xml:space="preserve">Loses the quota-neutral Tier 2 — the critical low-risk intermediate that avoids Tier 3 in most crises.</w:t>
+              <w:t xml:space="preserve">Activate all destination standby capacity during any event</w:t>
+            </w:r>
+          </w:p>
+        </w:tc>
+        <w:tc>
+          <w:tcPr/>
+          <w:p>
+            <w:pPr>
+              <w:pStyle w:val="Compact"/>
+              <w:jc w:val="left"/>
+            </w:pPr>
+            <w:r>
+              <w:t xml:space="preserve">Rejected; activation is source-specific via the DR index.</w:t>
             </w:r>
             <w:r>
               <w:t xml:space="preserve"> </w:t>
@@ -1960,45 +2892,6 @@
           </w:p>
         </w:tc>
       </w:tr>
-      <w:tr>
-        <w:tc>
-          <w:tcPr/>
-          <w:p>
-            <w:pPr>
-              <w:pStyle w:val="Compact"/>
-              <w:jc w:val="left"/>
-            </w:pPr>
-            <w:r>
-              <w:rPr>
-                <w:bCs/>
-                <w:b/>
-              </w:rPr>
-              <w:t xml:space="preserve">Four tiers (separate VMSS tier)</w:t>
-            </w:r>
-          </w:p>
-        </w:tc>
-        <w:tc>
-          <w:tcPr/>
-          <w:p>
-            <w:pPr>
-              <w:pStyle w:val="Compact"/>
-              <w:jc w:val="left"/>
-            </w:pPr>
-            <w:r>
-              <w:t xml:space="preserve">VMSS disassociation deferred as a Phase-1 limitation rather than a distinct tier.</w:t>
-            </w:r>
-            <w:r>
-              <w:t xml:space="preserve"> </w:t>
-            </w:r>
-            <w:r>
-              <w:rPr>
-                <w:rStyle w:val="VerbatimChar"/>
-              </w:rPr>
-              <w:t xml:space="preserve">[Decided]</w:t>
-            </w:r>
-          </w:p>
-        </w:tc>
-      </w:tr>
     </w:tbl>
     <w:p>
       <w:r>
@@ -2007,21 +2900,14 @@
         </w:pict>
       </w:r>
     </w:p>
-    <w:p>
-      <w:r>
-        <w:pict>
-          <v:rect style="width:0;height:1.5pt" o:hralign="center" o:hrstd="t" o:hr="t"/>
-        </w:pict>
-      </w:r>
-    </w:p>
-    <w:bookmarkEnd w:id="32"/>
-    <w:bookmarkStart w:id="33" w:name="appendix-adr-summary"/>
+    <w:bookmarkEnd w:id="30"/>
+    <w:bookmarkStart w:id="31" w:name="appendix---adr-summary"/>
     <w:p>
       <w:pPr>
         <w:pStyle w:val="Heading2"/>
       </w:pPr>
       <w:r>
-        <w:t xml:space="preserve">Appendix — ADR Summary</w:t>
+        <w:t xml:space="preserve">Appendix - ADR Summary</w:t>
       </w:r>
     </w:p>
     <w:tbl>
@@ -2059,7 +2945,7 @@
               <w:jc w:val="left"/>
             </w:pPr>
             <w:r>
-              <w:t xml:space="preserve">Hard Constraints Applied</w:t>
+              <w:t xml:space="preserve">Requirements Applied</w:t>
             </w:r>
           </w:p>
         </w:tc>
@@ -2085,44 +2971,44 @@
               <w:jc w:val="left"/>
             </w:pPr>
             <w:r>
-              <w:t xml:space="preserve">ADR-003 Capacity during DR</w:t>
-            </w:r>
-          </w:p>
-        </w:tc>
-        <w:tc>
-          <w:tcPr/>
-          <w:p>
-            <w:pPr>
-              <w:pStyle w:val="Compact"/>
-              <w:jc w:val="left"/>
-            </w:pPr>
-            <w:r>
-              <w:t xml:space="preserve">HC-1, HC-4, HC-6</w:t>
-            </w:r>
-          </w:p>
-        </w:tc>
-        <w:tc>
-          <w:tcPr/>
-          <w:p>
-            <w:pPr>
-              <w:pStyle w:val="Compact"/>
-              <w:jc w:val="left"/>
-            </w:pPr>
-            <w:r>
-              <w:t xml:space="preserve">Consumer-credential model and engine-mode state machine; quota-release latency measured</w:t>
+              <w:t xml:space="preserve">ADR-003 Capacity Management during DR</w:t>
+            </w:r>
+          </w:p>
+        </w:tc>
+        <w:tc>
+          <w:tcPr/>
+          <w:p>
+            <w:pPr>
+              <w:pStyle w:val="Compact"/>
+              <w:jc w:val="left"/>
+            </w:pPr>
+            <w:r>
+              <w:t xml:space="preserve">ENV-003..006, DR-001..019, PLC-010, DAT-002, OBS-004</w:t>
+            </w:r>
+          </w:p>
+        </w:tc>
+        <w:tc>
+          <w:tcPr/>
+          <w:p>
+            <w:pPr>
+              <w:pStyle w:val="Compact"/>
+              <w:jc w:val="left"/>
+            </w:pPr>
+            <w:r>
+              <w:t xml:space="preserve">POC-006 topology, POC-007 bootstrap sizing, POC-011 max-not-sum safety, DEC-001 Middle East DR, DEC-002 failback duration, DEP-001 sharing maturity</w:t>
             </w:r>
           </w:p>
         </w:tc>
       </w:tr>
     </w:tbl>
-    <w:bookmarkEnd w:id="33"/>
-    <w:bookmarkStart w:id="34" w:name="appendix-status-legend"/>
+    <w:bookmarkEnd w:id="31"/>
+    <w:bookmarkStart w:id="32" w:name="appendix---status-legend"/>
     <w:p>
       <w:pPr>
         <w:pStyle w:val="Heading2"/>
       </w:pPr>
       <w:r>
-        <w:t xml:space="preserve">Appendix — Status Legend</w:t>
+        <w:t xml:space="preserve">Appendix - Status Legend</w:t>
       </w:r>
     </w:p>
     <w:tbl>
@@ -2285,14 +3171,14 @@
         </w:tc>
       </w:tr>
     </w:tbl>
-    <w:bookmarkEnd w:id="34"/>
-    <w:bookmarkStart w:id="35" w:name="appendix-evidence-tag-taxonomy"/>
+    <w:bookmarkEnd w:id="32"/>
+    <w:bookmarkStart w:id="33" w:name="appendix---evidence-tag-taxonomy"/>
     <w:p>
       <w:pPr>
         <w:pStyle w:val="Heading2"/>
       </w:pPr>
       <w:r>
-        <w:t xml:space="preserve">Appendix — Evidence Tag Taxonomy</w:t>
+        <w:t xml:space="preserve">Appendix - Evidence Tag Taxonomy</w:t>
       </w:r>
     </w:p>
     <w:tbl>
@@ -2451,8 +3337,8 @@
         </w:tc>
       </w:tr>
     </w:tbl>
-    <w:bookmarkEnd w:id="35"/>
-    <w:bookmarkStart w:id="36" w:name="related-adrs"/>
+    <w:bookmarkEnd w:id="33"/>
+    <w:bookmarkStart w:id="34" w:name="related-adrs"/>
     <w:p>
       <w:pPr>
         <w:pStyle w:val="Heading2"/>
@@ -2465,7 +3351,7 @@
       <w:pPr>
         <w:numPr>
           <w:ilvl w:val="0"/>
-          <w:numId w:val="1005"/>
+          <w:numId w:val="1008"/>
         </w:numPr>
         <w:pStyle w:val="Compact"/>
       </w:pPr>
@@ -2474,7 +3360,7 @@
           <w:bCs/>
           <w:b/>
         </w:rPr>
-        <w:t xml:space="preserve">ADR-001 — Region Selection</w:t>
+        <w:t xml:space="preserve">ADR-001 - Region Selection and Customer Placement</w:t>
       </w:r>
       <w:r>
         <w:t xml:space="preserve"> </w:t>
@@ -2496,7 +3382,7 @@
       <w:pPr>
         <w:numPr>
           <w:ilvl w:val="0"/>
-          <w:numId w:val="1005"/>
+          <w:numId w:val="1008"/>
         </w:numPr>
         <w:pStyle w:val="Compact"/>
       </w:pPr>
@@ -2505,7 +3391,7 @@
           <w:bCs/>
           <w:b/>
         </w:rPr>
-        <w:t xml:space="preserve">ADR-002 — Quota and Capacity Management</w:t>
+        <w:t xml:space="preserve">ADR-002 - Quota and Capacity Management</w:t>
       </w:r>
       <w:r>
         <w:t xml:space="preserve"> </w:t>
@@ -2527,7 +3413,7 @@
       <w:pPr>
         <w:numPr>
           <w:ilvl w:val="0"/>
-          <w:numId w:val="1005"/>
+          <w:numId w:val="1008"/>
         </w:numPr>
         <w:pStyle w:val="Compact"/>
       </w:pPr>
@@ -2536,7 +3422,7 @@
           <w:bCs/>
           <w:b/>
         </w:rPr>
-        <w:t xml:space="preserve">ADR-004 — Forecast and Increase of Capacity and Quota</w:t>
+        <w:t xml:space="preserve">ADR-004 - Forecast, Reconciliation, and Increase of Capacity and Quota</w:t>
       </w:r>
       <w:r>
         <w:t xml:space="preserve"> </w:t>
@@ -2592,11 +3478,11 @@
         <w:t xml:space="preserve"> </w:t>
       </w:r>
       <w:r>
-        <w:t xml:space="preserve">After proof-of-concept validation of Azure Quota Groups GA and quota-release latency, and on resolution of the consumer-credential model and engine-mode state-machine items.</w:t>
-      </w:r>
-    </w:p>
-    <w:bookmarkEnd w:id="36"/>
-    <w:bookmarkEnd w:id="37"/>
+        <w:t xml:space="preserve">After POC-006, POC-007, POC-011, DEC-001, DEC-002, and Capacity Reservation Sharing maturity review.</w:t>
+      </w:r>
+    </w:p>
+    <w:bookmarkEnd w:id="34"/>
+    <w:bookmarkEnd w:id="35"/>
     <w:sectPr/>
   </w:body>
 </w:document>
@@ -2703,6 +3589,82 @@
       </w:pPr>
     </w:lvl>
   </w:abstractNum>
+  <w:abstractNum w:abstractNumId="991">
+    <w:nsid w:val="A991"/>
+    <w:multiLevelType w:val="multilevel"/>
+    <w:lvl w:ilvl="0">
+      <w:numFmt w:val="bullet"/>
+      <w:lvlText w:val="•"/>
+      <w:lvlJc w:val="left"/>
+      <w:pPr>
+        <w:ind w:left="720" w:hanging="480"/>
+      </w:pPr>
+    </w:lvl>
+    <w:lvl w:ilvl="1">
+      <w:numFmt w:val="bullet"/>
+      <w:lvlText w:val="–"/>
+      <w:lvlJc w:val="left"/>
+      <w:pPr>
+        <w:ind w:left="1440" w:hanging="480"/>
+      </w:pPr>
+    </w:lvl>
+    <w:lvl w:ilvl="2">
+      <w:numFmt w:val="bullet"/>
+      <w:lvlText w:val="•"/>
+      <w:lvlJc w:val="left"/>
+      <w:pPr>
+        <w:ind w:left="2160" w:hanging="480"/>
+      </w:pPr>
+    </w:lvl>
+    <w:lvl w:ilvl="3">
+      <w:numFmt w:val="bullet"/>
+      <w:lvlText w:val="–"/>
+      <w:lvlJc w:val="left"/>
+      <w:pPr>
+        <w:ind w:left="2880" w:hanging="480"/>
+      </w:pPr>
+    </w:lvl>
+    <w:lvl w:ilvl="4">
+      <w:numFmt w:val="bullet"/>
+      <w:lvlText w:val="•"/>
+      <w:lvlJc w:val="left"/>
+      <w:pPr>
+        <w:ind w:left="3600" w:hanging="480"/>
+      </w:pPr>
+    </w:lvl>
+    <w:lvl w:ilvl="5">
+      <w:numFmt w:val="bullet"/>
+      <w:lvlText w:val="–"/>
+      <w:lvlJc w:val="left"/>
+      <w:pPr>
+        <w:ind w:left="4320" w:hanging="480"/>
+      </w:pPr>
+    </w:lvl>
+    <w:lvl w:ilvl="6">
+      <w:numFmt w:val="bullet"/>
+      <w:lvlText w:val="•"/>
+      <w:lvlJc w:val="left"/>
+      <w:pPr>
+        <w:ind w:left="5040" w:hanging="480"/>
+      </w:pPr>
+    </w:lvl>
+    <w:lvl w:ilvl="7">
+      <w:numFmt w:val="bullet"/>
+      <w:lvlText w:val="–"/>
+      <w:lvlJc w:val="left"/>
+      <w:pPr>
+        <w:ind w:left="5760" w:hanging="480"/>
+      </w:pPr>
+    </w:lvl>
+    <w:lvl w:ilvl="8">
+      <w:numFmt w:val="bullet"/>
+      <w:lvlText w:val="•"/>
+      <w:lvlJc w:val="left"/>
+      <w:pPr>
+        <w:ind w:left="6480" w:hanging="480"/>
+      </w:pPr>
+    </w:lvl>
+  </w:abstractNum>
   <w:abstractNum w:abstractNumId="99411">
     <w:nsid w:val="A99411"/>
     <w:multiLevelType w:val="multilevel"/>
@@ -2788,86 +3750,13 @@
       </w:pPr>
     </w:lvl>
   </w:abstractNum>
-  <w:abstractNum w:abstractNumId="991">
-    <w:nsid w:val="A991"/>
-    <w:multiLevelType w:val="multilevel"/>
-    <w:lvl w:ilvl="0">
-      <w:numFmt w:val="bullet"/>
-      <w:lvlText w:val="•"/>
-      <w:lvlJc w:val="left"/>
-      <w:pPr>
-        <w:ind w:left="720" w:hanging="480"/>
-      </w:pPr>
-    </w:lvl>
-    <w:lvl w:ilvl="1">
-      <w:numFmt w:val="bullet"/>
-      <w:lvlText w:val="–"/>
-      <w:lvlJc w:val="left"/>
-      <w:pPr>
-        <w:ind w:left="1440" w:hanging="480"/>
-      </w:pPr>
-    </w:lvl>
-    <w:lvl w:ilvl="2">
-      <w:numFmt w:val="bullet"/>
-      <w:lvlText w:val="•"/>
-      <w:lvlJc w:val="left"/>
-      <w:pPr>
-        <w:ind w:left="2160" w:hanging="480"/>
-      </w:pPr>
-    </w:lvl>
-    <w:lvl w:ilvl="3">
-      <w:numFmt w:val="bullet"/>
-      <w:lvlText w:val="–"/>
-      <w:lvlJc w:val="left"/>
-      <w:pPr>
-        <w:ind w:left="2880" w:hanging="480"/>
-      </w:pPr>
-    </w:lvl>
-    <w:lvl w:ilvl="4">
-      <w:numFmt w:val="bullet"/>
-      <w:lvlText w:val="•"/>
-      <w:lvlJc w:val="left"/>
-      <w:pPr>
-        <w:ind w:left="3600" w:hanging="480"/>
-      </w:pPr>
-    </w:lvl>
-    <w:lvl w:ilvl="5">
-      <w:numFmt w:val="bullet"/>
-      <w:lvlText w:val="–"/>
-      <w:lvlJc w:val="left"/>
-      <w:pPr>
-        <w:ind w:left="4320" w:hanging="480"/>
-      </w:pPr>
-    </w:lvl>
-    <w:lvl w:ilvl="6">
-      <w:numFmt w:val="bullet"/>
-      <w:lvlText w:val="•"/>
-      <w:lvlJc w:val="left"/>
-      <w:pPr>
-        <w:ind w:left="5040" w:hanging="480"/>
-      </w:pPr>
-    </w:lvl>
-    <w:lvl w:ilvl="7">
-      <w:numFmt w:val="bullet"/>
-      <w:lvlText w:val="–"/>
-      <w:lvlJc w:val="left"/>
-      <w:pPr>
-        <w:ind w:left="5760" w:hanging="480"/>
-      </w:pPr>
-    </w:lvl>
-    <w:lvl w:ilvl="8">
-      <w:numFmt w:val="bullet"/>
-      <w:lvlText w:val="•"/>
-      <w:lvlJc w:val="left"/>
-      <w:pPr>
-        <w:ind w:left="6480" w:hanging="480"/>
-      </w:pPr>
-    </w:lvl>
-  </w:abstractNum>
   <w:num w:numId="1000">
     <w:abstractNumId w:val="990"/>
   </w:num>
   <w:num w:numId="1001">
+    <w:abstractNumId w:val="991"/>
+  </w:num>
+  <w:num w:numId="1002">
     <w:abstractNumId w:val="99411"/>
     <w:lvlOverride w:ilvl="0">
       <w:startOverride w:val="1"/>
@@ -2897,16 +3786,49 @@
       <w:startOverride w:val="1"/>
     </w:lvlOverride>
   </w:num>
-  <w:num w:numId="1002">
-    <w:abstractNumId w:val="991"/>
-  </w:num>
   <w:num w:numId="1003">
     <w:abstractNumId w:val="991"/>
   </w:num>
   <w:num w:numId="1004">
+    <w:abstractNumId w:val="99411"/>
+    <w:lvlOverride w:ilvl="0">
+      <w:startOverride w:val="1"/>
+    </w:lvlOverride>
+    <w:lvlOverride w:ilvl="1">
+      <w:startOverride w:val="1"/>
+    </w:lvlOverride>
+    <w:lvlOverride w:ilvl="2">
+      <w:startOverride w:val="1"/>
+    </w:lvlOverride>
+    <w:lvlOverride w:ilvl="3">
+      <w:startOverride w:val="1"/>
+    </w:lvlOverride>
+    <w:lvlOverride w:ilvl="4">
+      <w:startOverride w:val="1"/>
+    </w:lvlOverride>
+    <w:lvlOverride w:ilvl="5">
+      <w:startOverride w:val="1"/>
+    </w:lvlOverride>
+    <w:lvlOverride w:ilvl="6">
+      <w:startOverride w:val="1"/>
+    </w:lvlOverride>
+    <w:lvlOverride w:ilvl="7">
+      <w:startOverride w:val="1"/>
+    </w:lvlOverride>
+    <w:lvlOverride w:ilvl="8">
+      <w:startOverride w:val="1"/>
+    </w:lvlOverride>
+  </w:num>
+  <w:num w:numId="1005">
     <w:abstractNumId w:val="991"/>
   </w:num>
-  <w:num w:numId="1005">
+  <w:num w:numId="1006">
+    <w:abstractNumId w:val="991"/>
+  </w:num>
+  <w:num w:numId="1007">
+    <w:abstractNumId w:val="991"/>
+  </w:num>
+  <w:num w:numId="1008">
     <w:abstractNumId w:val="991"/>
   </w:num>
 </w:numbering>

</xml_diff>